<commit_message>
Add write read function from DAC and ADC
</commit_message>
<xml_diff>
--- a/doc/1220200037474.468173.000 ПЗ.docx
+++ b/doc/1220200037474.468173.000 ПЗ.docx
@@ -912,16 +912,18 @@
         <w:ind w:hanging="0" w:start="288"/>
         <w:rPr/>
       </w:pPr>
-      <w:bookmarkStart w:id="1" w:name="_Toc150437791"/>
-      <w:bookmarkStart w:id="2" w:name="_Toc214207942"/>
-      <w:bookmarkStart w:id="3" w:name="_Toc224141510"/>
+      <w:bookmarkStart w:id="1" w:name="__RefHeading___Toc303_3911609550"/>
+      <w:bookmarkStart w:id="2" w:name="_Toc224141510"/>
+      <w:bookmarkStart w:id="3" w:name="_Toc214207942"/>
+      <w:bookmarkStart w:id="4" w:name="_Toc150437791"/>
+      <w:bookmarkEnd w:id="1"/>
       <w:r>
         <w:rPr/>
         <w:t>Содержание</w:t>
       </w:r>
-      <w:bookmarkEnd w:id="1"/>
       <w:bookmarkEnd w:id="2"/>
       <w:bookmarkEnd w:id="3"/>
+      <w:bookmarkEnd w:id="4"/>
     </w:p>
     <w:sdt>
       <w:sdtPr>
@@ -936,320 +938,679 @@
             <w:pStyle w:val="TOC1"/>
             <w:tabs>
               <w:tab w:val="clear" w:pos="708"/>
-              <w:tab w:val="right" w:pos="9911" w:leader="dot"/>
+              <w:tab w:val="right" w:pos="9920" w:leader="dot"/>
             </w:tabs>
-            <w:rPr>
-              <w:rFonts w:ascii="Calibri" w:hAnsi="Calibri" w:eastAsia="" w:asciiTheme="minorHAnsi" w:eastAsiaTheme="minorEastAsia" w:hAnsiTheme="minorHAnsi"/>
-              <w:bCs w:val="false"/>
-              <w:sz w:val="22"/>
-              <w:szCs w:val="22"/>
-              <w:lang w:eastAsia="ru-RU"/>
-            </w:rPr>
+            <w:rPr/>
           </w:pPr>
           <w:r>
             <w:fldChar w:fldCharType="begin"/>
           </w:r>
           <w:r>
-            <w:rPr/>
+            <w:rPr>
+              <w:rStyle w:val="Style7"/>
+            </w:rPr>
             <w:instrText xml:space="preserve"> TOC \o "1-2" \h</w:instrText>
           </w:r>
           <w:r>
-            <w:rPr/>
+            <w:rPr>
+              <w:rStyle w:val="Style7"/>
+            </w:rPr>
             <w:fldChar w:fldCharType="separate"/>
           </w:r>
-          <w:r>
-            <w:rPr/>
-            <w:t>Содержание</w:t>
-            <w:tab/>
-            <w:t>2</w:t>
-          </w:r>
+          <w:hyperlink w:anchor="__RefHeading___Toc303_3911609550" w:tooltip="Содержание">
+            <w:r>
+              <w:rPr>
+                <w:rStyle w:val="Style7"/>
+              </w:rPr>
+              <w:t>Содержание</w:t>
+              <w:tab/>
+              <w:t>2</w:t>
+            </w:r>
+          </w:hyperlink>
         </w:p>
         <w:p>
           <w:pPr>
             <w:pStyle w:val="TOC1"/>
             <w:tabs>
               <w:tab w:val="clear" w:pos="708"/>
-              <w:tab w:val="right" w:pos="9911" w:leader="dot"/>
+              <w:tab w:val="right" w:pos="9920" w:leader="dot"/>
             </w:tabs>
-            <w:rPr>
-              <w:rFonts w:ascii="Calibri" w:hAnsi="Calibri" w:eastAsia="" w:asciiTheme="minorHAnsi" w:eastAsiaTheme="minorEastAsia" w:hAnsiTheme="minorHAnsi"/>
-              <w:bCs w:val="false"/>
-              <w:sz w:val="22"/>
-              <w:szCs w:val="22"/>
-              <w:lang w:eastAsia="ru-RU"/>
-            </w:rPr>
+            <w:rPr/>
           </w:pPr>
-          <w:r>
-            <w:rPr/>
-            <w:t>1 Цели работы</w:t>
-            <w:tab/>
-            <w:t>3</w:t>
-          </w:r>
+          <w:hyperlink w:anchor="__RefHeading___Toc305_3911609550" w:tooltip="Введение">
+            <w:r>
+              <w:rPr>
+                <w:rStyle w:val="Style7"/>
+              </w:rPr>
+              <w:t>1 Введение</w:t>
+              <w:tab/>
+              <w:t>5</w:t>
+            </w:r>
+          </w:hyperlink>
         </w:p>
         <w:p>
           <w:pPr>
             <w:pStyle w:val="TOC1"/>
             <w:tabs>
               <w:tab w:val="clear" w:pos="708"/>
-              <w:tab w:val="right" w:pos="9911" w:leader="dot"/>
+              <w:tab w:val="right" w:pos="9920" w:leader="dot"/>
             </w:tabs>
-            <w:rPr>
-              <w:rFonts w:ascii="Calibri" w:hAnsi="Calibri" w:eastAsia="" w:asciiTheme="minorHAnsi" w:eastAsiaTheme="minorEastAsia" w:hAnsiTheme="minorHAnsi"/>
-              <w:bCs w:val="false"/>
-              <w:sz w:val="22"/>
-              <w:szCs w:val="22"/>
-              <w:lang w:eastAsia="ru-RU"/>
-            </w:rPr>
+            <w:rPr/>
           </w:pPr>
-          <w:r>
-            <w:rPr/>
-            <w:t>2 Задание на выполнение работы</w:t>
-            <w:tab/>
-            <w:t>4</w:t>
-          </w:r>
+          <w:hyperlink w:anchor="__RefHeading___Toc307_3911609550" w:tooltip="Технические характеристики">
+            <w:r>
+              <w:rPr>
+                <w:rStyle w:val="Style7"/>
+              </w:rPr>
+              <w:t>2 Технические характеристики</w:t>
+              <w:tab/>
+              <w:t>6</w:t>
+            </w:r>
+          </w:hyperlink>
         </w:p>
         <w:p>
           <w:pPr>
             <w:pStyle w:val="TOC1"/>
             <w:tabs>
               <w:tab w:val="clear" w:pos="708"/>
-              <w:tab w:val="right" w:pos="9911" w:leader="dot"/>
+              <w:tab w:val="right" w:pos="9920" w:leader="dot"/>
             </w:tabs>
-            <w:rPr>
-              <w:rFonts w:ascii="Calibri" w:hAnsi="Calibri" w:eastAsia="" w:asciiTheme="minorHAnsi" w:eastAsiaTheme="minorEastAsia" w:hAnsiTheme="minorHAnsi"/>
-              <w:bCs w:val="false"/>
-              <w:sz w:val="22"/>
-              <w:szCs w:val="22"/>
-              <w:lang w:eastAsia="ru-RU"/>
-            </w:rPr>
+            <w:rPr/>
           </w:pPr>
-          <w:r>
+          <w:hyperlink w:anchor="__RefHeading___Toc309_3911609550" w:tooltip="Выбор и обоснование структурной схемы">
+            <w:r>
+              <w:rPr>
+                <w:rStyle w:val="Style7"/>
+              </w:rPr>
+              <w:t>3 Выбор и обоснование структурной схемы</w:t>
+              <w:tab/>
+              <w:t>6</w:t>
+            </w:r>
+          </w:hyperlink>
+        </w:p>
+        <w:p>
+          <w:pPr>
+            <w:pStyle w:val="TOC1"/>
+            <w:tabs>
+              <w:tab w:val="clear" w:pos="708"/>
+              <w:tab w:val="right" w:pos="9920" w:leader="dot"/>
+            </w:tabs>
             <w:rPr/>
-            <w:t>3 Основная часть лабораторной работы</w:t>
-            <w:tab/>
-            <w:t>5</w:t>
-          </w:r>
+          </w:pPr>
+          <w:hyperlink w:anchor="__RefHeading___Toc311_3911609550" w:tooltip="Расчетно-теоретическая часть">
+            <w:r>
+              <w:rPr>
+                <w:rStyle w:val="Style7"/>
+              </w:rPr>
+              <w:t>4 Расчетно-теоретическая часть</w:t>
+              <w:tab/>
+              <w:t>8</w:t>
+            </w:r>
+          </w:hyperlink>
         </w:p>
         <w:p>
           <w:pPr>
             <w:pStyle w:val="TOC2"/>
             <w:tabs>
               <w:tab w:val="clear" w:pos="708"/>
-              <w:tab w:val="right" w:pos="9911" w:leader="dot"/>
+              <w:tab w:val="right" w:pos="9920" w:leader="dot"/>
             </w:tabs>
-            <w:rPr>
-              <w:rFonts w:ascii="Calibri" w:hAnsi="Calibri" w:eastAsia="" w:cs="" w:asciiTheme="minorHAnsi" w:cstheme="minorBidi" w:eastAsiaTheme="minorEastAsia" w:hAnsiTheme="minorHAnsi"/>
-              <w:bCs w:val="false"/>
-              <w:sz w:val="22"/>
-              <w:szCs w:val="22"/>
-              <w:lang w:eastAsia="ru-RU"/>
-            </w:rPr>
+            <w:rPr/>
           </w:pPr>
-          <w:r>
+          <w:hyperlink w:anchor="__RefHeading___Toc313_3911609550" w:tooltip="Определение">
+            <w:r>
+              <w:rPr>
+                <w:rStyle w:val="Style7"/>
+              </w:rPr>
+              <w:t>4.1 Определение</w:t>
+              <w:tab/>
+              <w:t>8</w:t>
+            </w:r>
+          </w:hyperlink>
+        </w:p>
+        <w:p>
+          <w:pPr>
+            <w:pStyle w:val="TOC1"/>
+            <w:tabs>
+              <w:tab w:val="clear" w:pos="708"/>
+              <w:tab w:val="right" w:pos="9920" w:leader="dot"/>
+            </w:tabs>
             <w:rPr/>
-            <w:t>3.1 Реализация модели регулятора.</w:t>
-            <w:tab/>
-            <w:t>5</w:t>
-          </w:r>
+          </w:pPr>
+          <w:hyperlink w:anchor="__RefHeading___Toc315_3911609550" w:tooltip="Описание электрической схемы">
+            <w:r>
+              <w:rPr>
+                <w:rStyle w:val="Style7"/>
+              </w:rPr>
+              <w:t>5 Описание электрической схемы</w:t>
+              <w:tab/>
+              <w:t>8</w:t>
+            </w:r>
+          </w:hyperlink>
         </w:p>
         <w:p>
           <w:pPr>
             <w:pStyle w:val="TOC2"/>
             <w:tabs>
               <w:tab w:val="clear" w:pos="708"/>
-              <w:tab w:val="right" w:pos="9911" w:leader="dot"/>
+              <w:tab w:val="right" w:pos="9920" w:leader="dot"/>
             </w:tabs>
-            <w:rPr>
-              <w:rFonts w:ascii="Calibri" w:hAnsi="Calibri" w:eastAsia="" w:cs="" w:asciiTheme="minorHAnsi" w:cstheme="minorBidi" w:eastAsiaTheme="minorEastAsia" w:hAnsiTheme="minorHAnsi"/>
-              <w:bCs w:val="false"/>
-              <w:sz w:val="22"/>
-              <w:szCs w:val="22"/>
-              <w:lang w:eastAsia="ru-RU"/>
-            </w:rPr>
+            <w:rPr/>
           </w:pPr>
-          <w:r>
+          <w:hyperlink w:anchor="__RefHeading___Toc317_3911609550" w:tooltip="Электрическая принципиальная приведена в электронном документе (1220200037474.468173.000 Э3 с перечнем элементов).">
+            <w:r>
+              <w:rPr>
+                <w:rStyle w:val="Style7"/>
+              </w:rPr>
+              <w:t>5.1 Электрическая принципиальная приведена в электронном документе (1220200037474.468173.000 Э3 с перечнем элементов).</w:t>
+              <w:tab/>
+              <w:t>8</w:t>
+            </w:r>
+          </w:hyperlink>
+        </w:p>
+        <w:p>
+          <w:pPr>
+            <w:pStyle w:val="TOC1"/>
+            <w:tabs>
+              <w:tab w:val="clear" w:pos="708"/>
+              <w:tab w:val="right" w:pos="9920" w:leader="dot"/>
+            </w:tabs>
             <w:rPr/>
-            <w:t>3.2 Модель объекта управления с параметрическими возмущениями.</w:t>
-            <w:tab/>
-            <w:t>5</w:t>
-          </w:r>
+          </w:pPr>
+          <w:hyperlink w:anchor="__RefHeading___Toc319_3911609550" w:tooltip="Конструкторский раздел">
+            <w:r>
+              <w:rPr>
+                <w:rStyle w:val="Style7"/>
+              </w:rPr>
+              <w:t>6 Конструкторский раздел</w:t>
+              <w:tab/>
+              <w:t>8</w:t>
+            </w:r>
+          </w:hyperlink>
         </w:p>
         <w:p>
           <w:pPr>
             <w:pStyle w:val="TOC2"/>
             <w:tabs>
               <w:tab w:val="clear" w:pos="708"/>
-              <w:tab w:val="right" w:pos="9911" w:leader="dot"/>
+              <w:tab w:val="right" w:pos="9920" w:leader="dot"/>
             </w:tabs>
-            <w:rPr>
-              <w:rFonts w:ascii="Calibri" w:hAnsi="Calibri" w:eastAsia="" w:cs="" w:asciiTheme="minorHAnsi" w:cstheme="minorBidi" w:eastAsiaTheme="minorEastAsia" w:hAnsiTheme="minorHAnsi"/>
-              <w:bCs w:val="false"/>
-              <w:sz w:val="22"/>
-              <w:szCs w:val="22"/>
-              <w:lang w:eastAsia="ru-RU"/>
-            </w:rPr>
+            <w:rPr/>
           </w:pPr>
-          <w:r>
-            <w:rPr/>
-            <w:t xml:space="preserve">3.3 Общая модель контура управления в </w:t>
-          </w:r>
-          <w:r>
-            <w:rPr>
-              <w:lang w:val="en-US"/>
-            </w:rPr>
-            <w:t>Simulink</w:t>
-          </w:r>
-          <w:r>
-            <w:rPr/>
-            <w:t>.</w:t>
-            <w:tab/>
-            <w:t>6</w:t>
-          </w:r>
+          <w:hyperlink w:anchor="__RefHeading___Toc321_3911609550" w:tooltip="Конструкция устройства создана по подобию шилдов. В несущую плату содержащую МК1 и МК2 вставляется шилд дисплея.">
+            <w:r>
+              <w:rPr>
+                <w:rStyle w:val="Style7"/>
+              </w:rPr>
+              <w:t>6.1 Конструкция устройства создана по подобию шилдов. В несущую плату содержащую МК1 и МК2 вставляется шилд дисплея.</w:t>
+              <w:tab/>
+              <w:t>8</w:t>
+            </w:r>
+          </w:hyperlink>
         </w:p>
         <w:p>
           <w:pPr>
             <w:pStyle w:val="TOC2"/>
             <w:tabs>
               <w:tab w:val="clear" w:pos="708"/>
-              <w:tab w:val="right" w:pos="9911" w:leader="dot"/>
+              <w:tab w:val="right" w:pos="9920" w:leader="dot"/>
             </w:tabs>
-            <w:rPr>
-              <w:rFonts w:ascii="Calibri" w:hAnsi="Calibri" w:eastAsia="" w:cs="" w:asciiTheme="minorHAnsi" w:cstheme="minorBidi" w:eastAsiaTheme="minorEastAsia" w:hAnsiTheme="minorHAnsi"/>
-              <w:bCs w:val="false"/>
-              <w:sz w:val="22"/>
-              <w:szCs w:val="22"/>
-              <w:lang w:eastAsia="ru-RU"/>
-            </w:rPr>
+            <w:rPr/>
           </w:pPr>
-          <w:r>
-            <w:rPr/>
-            <w:t xml:space="preserve">3.4 Работа регулятора без алгоритма адаптации (при </w:t>
-          </w:r>
-          <w:r>
-            <w:rPr>
-              <w:rFonts w:cs="Times New Roman"/>
-              <w:lang w:val="en-US"/>
-            </w:rPr>
-            <w:t>γ</w:t>
-          </w:r>
-          <w:r>
-            <w:rPr/>
-            <w:t xml:space="preserve"> = 0).</w:t>
-            <w:tab/>
-            <w:t>6</w:t>
-          </w:r>
+          <w:hyperlink w:anchor="__RefHeading___Toc323_3911609550" w:tooltip="Корпус печатается на 3D принтере.">
+            <w:r>
+              <w:rPr>
+                <w:rStyle w:val="Style7"/>
+              </w:rPr>
+              <w:t>6.2 Корпус печатается на 3D принтере.</w:t>
+              <w:tab/>
+              <w:t>8</w:t>
+            </w:r>
+          </w:hyperlink>
         </w:p>
         <w:p>
           <w:pPr>
             <w:pStyle w:val="TOC2"/>
             <w:tabs>
               <w:tab w:val="clear" w:pos="708"/>
-              <w:tab w:val="right" w:pos="9911" w:leader="dot"/>
+              <w:tab w:val="right" w:pos="9920" w:leader="dot"/>
             </w:tabs>
-            <w:rPr>
-              <w:rFonts w:ascii="Calibri" w:hAnsi="Calibri" w:eastAsia="" w:cs="" w:asciiTheme="minorHAnsi" w:cstheme="minorBidi" w:eastAsiaTheme="minorEastAsia" w:hAnsiTheme="minorHAnsi"/>
-              <w:bCs w:val="false"/>
-              <w:sz w:val="22"/>
-              <w:szCs w:val="22"/>
-              <w:lang w:eastAsia="ru-RU"/>
-            </w:rPr>
+            <w:rPr/>
           </w:pPr>
-          <w:r>
+          <w:hyperlink w:anchor="__RefHeading___Toc325_3911609550" w:tooltip="Печатная плата двухслойная с толщиной меди 0,35 мкм.">
+            <w:r>
+              <w:rPr>
+                <w:rStyle w:val="Style7"/>
+              </w:rPr>
+              <w:t>6.3 Печатная плата двухслойная с толщиной меди 0,35 мкм.</w:t>
+              <w:tab/>
+              <w:t>8</w:t>
+            </w:r>
+          </w:hyperlink>
+        </w:p>
+        <w:p>
+          <w:pPr>
+            <w:pStyle w:val="TOC1"/>
+            <w:tabs>
+              <w:tab w:val="clear" w:pos="708"/>
+              <w:tab w:val="right" w:pos="9920" w:leader="dot"/>
+            </w:tabs>
             <w:rPr/>
-            <w:t xml:space="preserve">3.5 Работа регулятора с алгоритмом адаптации при </w:t>
-          </w:r>
-          <w:r>
-            <w:rPr>
-              <w:rFonts w:cs="Times New Roman"/>
-              <w:lang w:val="en-US"/>
-            </w:rPr>
-            <w:t>γ</w:t>
-          </w:r>
-          <w:r>
-            <w:rPr/>
-            <w:t xml:space="preserve"> = 0.898</w:t>
-            <w:tab/>
-            <w:t>9</w:t>
-          </w:r>
+          </w:pPr>
+          <w:hyperlink w:anchor="__RefHeading___Toc327_3911609550" w:tooltip="Алгоритм работы">
+            <w:r>
+              <w:rPr>
+                <w:rStyle w:val="Style7"/>
+              </w:rPr>
+              <w:t>7 Алгоритм работы</w:t>
+              <w:tab/>
+              <w:t>8</w:t>
+            </w:r>
+          </w:hyperlink>
         </w:p>
         <w:p>
           <w:pPr>
             <w:pStyle w:val="TOC2"/>
             <w:tabs>
               <w:tab w:val="clear" w:pos="708"/>
-              <w:tab w:val="right" w:pos="9911" w:leader="dot"/>
+              <w:tab w:val="right" w:pos="9920" w:leader="dot"/>
             </w:tabs>
-            <w:rPr>
-              <w:rFonts w:ascii="Calibri" w:hAnsi="Calibri" w:eastAsia="" w:cs="" w:asciiTheme="minorHAnsi" w:cstheme="minorBidi" w:eastAsiaTheme="minorEastAsia" w:hAnsiTheme="minorHAnsi"/>
-              <w:bCs w:val="false"/>
-              <w:sz w:val="22"/>
-              <w:szCs w:val="22"/>
-              <w:lang w:eastAsia="ru-RU"/>
-            </w:rPr>
+            <w:rPr/>
           </w:pPr>
-          <w:r>
-            <w:rPr/>
-            <w:t xml:space="preserve">3.6 Критическое значение коэффициента </w:t>
-          </w:r>
-          <w:r>
-            <w:rPr>
-              <w:rFonts w:cs="Times New Roman"/>
-              <w:lang w:val="en-US"/>
-            </w:rPr>
-            <w:t>γ</w:t>
-          </w:r>
-          <w:r>
-            <w:rPr/>
-            <w:t>.</w:t>
-            <w:tab/>
-            <w:t>11</w:t>
-          </w:r>
+          <w:hyperlink w:anchor="__RefHeading___Toc329_3911609550" w:tooltip="В данном разделе приведено описание алгоритма работы устройства.">
+            <w:r>
+              <w:rPr>
+                <w:rStyle w:val="Style7"/>
+              </w:rPr>
+              <w:t>7.1 В данном разделе приведено описание алгоритма работы устройства.</w:t>
+              <w:tab/>
+              <w:t>8</w:t>
+            </w:r>
+          </w:hyperlink>
         </w:p>
         <w:p>
           <w:pPr>
             <w:pStyle w:val="TOC2"/>
             <w:tabs>
               <w:tab w:val="clear" w:pos="708"/>
-              <w:tab w:val="right" w:pos="9911" w:leader="dot"/>
+              <w:tab w:val="right" w:pos="9920" w:leader="dot"/>
             </w:tabs>
-            <w:rPr>
-              <w:rFonts w:ascii="Calibri" w:hAnsi="Calibri" w:eastAsia="" w:cs="" w:asciiTheme="minorHAnsi" w:cstheme="minorBidi" w:eastAsiaTheme="minorEastAsia" w:hAnsiTheme="minorHAnsi"/>
-              <w:bCs w:val="false"/>
-              <w:sz w:val="22"/>
-              <w:szCs w:val="22"/>
-              <w:lang w:eastAsia="ru-RU"/>
-            </w:rPr>
+            <w:rPr/>
           </w:pPr>
-          <w:r>
+          <w:hyperlink w:anchor="__RefHeading___Toc331_3911609550" w:tooltip="После подачи питания на схему начинается работа загрузчика (стандартный bootloader esp-idf). Загрузчик инициализирует контроллер памяти, вектора прерываний. После передает управление основной прошивке пользователя.">
+            <w:r>
+              <w:rPr>
+                <w:rStyle w:val="Style7"/>
+              </w:rPr>
+              <w:t>7.2 После подачи питания на схему начинается работа загрузчика (стандартный bootloader esp-idf). Загрузчик инициализирует контроллер памяти, вектора прерываний. После передает управление основной прошивке пользователя.</w:t>
+              <w:tab/>
+              <w:t>8</w:t>
+            </w:r>
+          </w:hyperlink>
+        </w:p>
+        <w:p>
+          <w:pPr>
+            <w:pStyle w:val="TOC2"/>
+            <w:tabs>
+              <w:tab w:val="clear" w:pos="708"/>
+              <w:tab w:val="right" w:pos="9920" w:leader="dot"/>
+            </w:tabs>
             <w:rPr/>
-            <w:t>3.7 Сравнение полученных результатов</w:t>
-            <w:tab/>
-            <w:t>12</w:t>
-          </w:r>
+          </w:pPr>
+          <w:hyperlink w:anchor="__RefHeading___Toc333_3911609550" w:tooltip="В основной прошивке МК1 последовательно инициализируется работа с МК2 (ch32v203). Подчиненный контроллер переводится в режим загрузки из системной памяти (путем подтяжки входа boot0 к 3,3В).">
+            <w:r>
+              <w:rPr>
+                <w:rStyle w:val="Style7"/>
+              </w:rPr>
+              <w:t>7.4 В основной прошивке МК1 последовательно инициализируется работа с МК2 (ch32v203). Подчиненный контроллер переводится в режим загрузки из системной памяти (путем подтяжки входа boot0 к 3,3В).</w:t>
+              <w:tab/>
+              <w:t>8</w:t>
+            </w:r>
+          </w:hyperlink>
+        </w:p>
+        <w:p>
+          <w:pPr>
+            <w:pStyle w:val="TOC2"/>
+            <w:tabs>
+              <w:tab w:val="clear" w:pos="708"/>
+              <w:tab w:val="right" w:pos="9920" w:leader="dot"/>
+            </w:tabs>
+            <w:rPr/>
+          </w:pPr>
+          <w:hyperlink w:anchor="__RefHeading___Toc335_3911609550" w:tooltip="Происходит инициализация дисплея. Дисплей работает под управлением бибилиотеки esp-lcd. Интерфейс отрисовывается при помощи графической бибилиотеки esp-lvgl.">
+            <w:r>
+              <w:rPr>
+                <w:rStyle w:val="Style7"/>
+              </w:rPr>
+              <w:t>7.5 Происходит инициализация дисплея. Дисплей работает под управлением бибилиотеки esp-lcd. Интерфейс отрисовывается при помощи графической бибилиотеки esp-lvgl.</w:t>
+              <w:tab/>
+              <w:t>9</w:t>
+            </w:r>
+          </w:hyperlink>
+        </w:p>
+        <w:p>
+          <w:pPr>
+            <w:pStyle w:val="TOC2"/>
+            <w:tabs>
+              <w:tab w:val="clear" w:pos="708"/>
+              <w:tab w:val="right" w:pos="9920" w:leader="dot"/>
+            </w:tabs>
+            <w:rPr/>
+          </w:pPr>
+          <w:hyperlink w:anchor="__RefHeading___Toc337_3911609550" w:tooltip="Который позволяет с помощью команд wchisp писать, стирать, считывать флэш память. Считывается прошивкf МК2. Если прошивка в МК2 соответствует версии прошивки МК2 лежащей внутри прошивки МК1, происходит перезагрузка МК2 без перепрошивки. Иначе происходит перепрошивка МК2 и также его перезагрузка.">
+            <w:r>
+              <w:rPr>
+                <w:rStyle w:val="Style7"/>
+              </w:rPr>
+              <w:t>7.6 Который позволяет с помощью команд wchisp писать, стирать, считывать флэш память. Считывается прошивкf МК2. Если прошивка в МК2 соответствует версии прошивки МК2 лежащей внутри прошивки МК1, происходит перезагрузка МК2 без перепрошивки. Иначе происходит перепрошивка МК2 и также его перезагрузка.</w:t>
+              <w:tab/>
+              <w:t>9</w:t>
+            </w:r>
+          </w:hyperlink>
+        </w:p>
+        <w:p>
+          <w:pPr>
+            <w:pStyle w:val="TOC2"/>
+            <w:tabs>
+              <w:tab w:val="clear" w:pos="708"/>
+              <w:tab w:val="right" w:pos="9920" w:leader="dot"/>
+            </w:tabs>
+            <w:rPr/>
+          </w:pPr>
+          <w:hyperlink w:anchor="__RefHeading___Toc339_3911609550" w:tooltip="После запуска МК2 в цикле опрашивает энкодеры и кнопки. Если состояние энкодера или кнопки изменилось данные изменения передаются по UART в МК1.">
+            <w:r>
+              <w:rPr>
+                <w:rStyle w:val="Style7"/>
+              </w:rPr>
+              <w:t>7.7 После запуска МК2 в цикле опрашивает энкодеры и кнопки. Если состояние энкодера или кнопки изменилось данные изменения передаются по UART в МК1.</w:t>
+              <w:tab/>
+              <w:t>9</w:t>
+            </w:r>
+          </w:hyperlink>
+        </w:p>
+        <w:p>
+          <w:pPr>
+            <w:pStyle w:val="TOC2"/>
+            <w:tabs>
+              <w:tab w:val="clear" w:pos="708"/>
+              <w:tab w:val="right" w:pos="9920" w:leader="dot"/>
+            </w:tabs>
+            <w:rPr/>
+          </w:pPr>
+          <w:hyperlink w:anchor="__RefHeading___Toc341_3911609550" w:tooltip="В МК1 запускаются следующие задачи:">
+            <w:r>
+              <w:rPr>
+                <w:rStyle w:val="Style7"/>
+              </w:rPr>
+              <w:t>7.8 В МК1 запускаются следующие задачи:</w:t>
+              <w:tab/>
+              <w:t>9</w:t>
+            </w:r>
+          </w:hyperlink>
+        </w:p>
+        <w:p>
+          <w:pPr>
+            <w:pStyle w:val="TOC2"/>
+            <w:tabs>
+              <w:tab w:val="clear" w:pos="708"/>
+              <w:tab w:val="right" w:pos="9920" w:leader="dot"/>
+            </w:tabs>
+            <w:rPr/>
+          </w:pPr>
+          <w:hyperlink w:anchor="__RefHeading___Toc343_3911609550" w:tooltip="uart_handler — считывать по uart от МК2 состояние кнопок и энкодеров;">
+            <w:r>
+              <w:rPr>
+                <w:rStyle w:val="Style7"/>
+              </w:rPr>
+              <w:t>uart_handler — считывать по uart от МК2 состояние кнопок и энкодеров;</w:t>
+              <w:tab/>
+              <w:t>9</w:t>
+            </w:r>
+          </w:hyperlink>
+        </w:p>
+        <w:p>
+          <w:pPr>
+            <w:pStyle w:val="TOC2"/>
+            <w:tabs>
+              <w:tab w:val="clear" w:pos="708"/>
+              <w:tab w:val="right" w:pos="9920" w:leader="dot"/>
+            </w:tabs>
+            <w:rPr/>
+          </w:pPr>
+          <w:hyperlink w:anchor="__RefHeading___Toc345_3911609550" w:tooltip="lvgl_update — обновляет экран и состояние кнопок;">
+            <w:r>
+              <w:rPr>
+                <w:rStyle w:val="Style7"/>
+              </w:rPr>
+              <w:t>lvgl_update — обновляет экран и состояние кнопок;</w:t>
+              <w:tab/>
+              <w:t>9</w:t>
+            </w:r>
+          </w:hyperlink>
+        </w:p>
+        <w:p>
+          <w:pPr>
+            <w:pStyle w:val="TOC2"/>
+            <w:tabs>
+              <w:tab w:val="clear" w:pos="708"/>
+              <w:tab w:val="right" w:pos="9920" w:leader="dot"/>
+            </w:tabs>
+            <w:rPr/>
+          </w:pPr>
+          <w:hyperlink w:anchor="__RefHeading___Toc347_3911609550" w:tooltip="adc_handler - опрос и получение данных из АЦП;">
+            <w:r>
+              <w:rPr>
+                <w:rStyle w:val="Style7"/>
+              </w:rPr>
+              <w:t>adc_handler - опрос и получение данных из АЦП;</w:t>
+              <w:tab/>
+              <w:t>9</w:t>
+            </w:r>
+          </w:hyperlink>
+        </w:p>
+        <w:p>
+          <w:pPr>
+            <w:pStyle w:val="TOC2"/>
+            <w:tabs>
+              <w:tab w:val="clear" w:pos="708"/>
+              <w:tab w:val="right" w:pos="9920" w:leader="dot"/>
+            </w:tabs>
+            <w:rPr/>
+          </w:pPr>
+          <w:hyperlink w:anchor="__RefHeading___Toc349_3911609550" w:tooltip="dac_handler — обновление и отправка данных для ЦАП;">
+            <w:r>
+              <w:rPr>
+                <w:rStyle w:val="Style7"/>
+              </w:rPr>
+              <w:t>dac_handler — обновление и отправка данных для ЦАП;</w:t>
+              <w:tab/>
+              <w:t>9</w:t>
+            </w:r>
+          </w:hyperlink>
+        </w:p>
+        <w:p>
+          <w:pPr>
+            <w:pStyle w:val="TOC2"/>
+            <w:tabs>
+              <w:tab w:val="clear" w:pos="708"/>
+              <w:tab w:val="right" w:pos="9920" w:leader="dot"/>
+            </w:tabs>
+            <w:rPr/>
+          </w:pPr>
+          <w:hyperlink w:anchor="__RefHeading___Toc351_3911609550" w:tooltip="app_cycle — обработка в цикле состояния задач и обновление их статуса, обновление буферов, запуск fft.">
+            <w:r>
+              <w:rPr>
+                <w:rStyle w:val="Style7"/>
+              </w:rPr>
+              <w:t>app_cycle — обработка в цикле состояния задач и обновление их статуса, обновление буферов, запуск fft.</w:t>
+              <w:tab/>
+              <w:t>9</w:t>
+            </w:r>
+          </w:hyperlink>
         </w:p>
         <w:p>
           <w:pPr>
             <w:pStyle w:val="TOC1"/>
             <w:tabs>
               <w:tab w:val="clear" w:pos="708"/>
-              <w:tab w:val="right" w:pos="9911" w:leader="dot"/>
+              <w:tab w:val="right" w:pos="9920" w:leader="dot"/>
             </w:tabs>
+            <w:rPr/>
+          </w:pPr>
+          <w:hyperlink w:anchor="__RefHeading___Toc353_3911609550" w:tooltip="Заключение">
+            <w:r>
+              <w:rPr>
+                <w:rStyle w:val="Style7"/>
+              </w:rPr>
+              <w:t>8 Заключение</w:t>
+              <w:tab/>
+              <w:t>9</w:t>
+            </w:r>
+          </w:hyperlink>
+        </w:p>
+        <w:p>
+          <w:pPr>
+            <w:pStyle w:val="TOC1"/>
+            <w:tabs>
+              <w:tab w:val="clear" w:pos="708"/>
+              <w:tab w:val="right" w:pos="9920" w:leader="dot"/>
+            </w:tabs>
+            <w:rPr/>
+          </w:pPr>
+          <w:hyperlink w:anchor="__RefHeading___Toc355_3911609550" w:tooltip="Список использованных источников">
+            <w:r>
+              <w:rPr>
+                <w:rStyle w:val="Style7"/>
+              </w:rPr>
+              <w:t>9 Список использованных источников</w:t>
+              <w:tab/>
+              <w:t>9</w:t>
+            </w:r>
+          </w:hyperlink>
+        </w:p>
+        <w:p>
+          <w:pPr>
+            <w:pStyle w:val="TOC2"/>
+            <w:tabs>
+              <w:tab w:val="clear" w:pos="708"/>
+              <w:tab w:val="right" w:pos="9920" w:leader="dot"/>
+            </w:tabs>
+            <w:rPr/>
+          </w:pPr>
+          <w:hyperlink w:anchor="__RefHeading___Toc357_3911609550" w:tooltip="https://docs.espressif.com/projects/esp-idf/en/stable/esp32/get-started/index.html">
+            <w:r>
+              <w:rPr>
+                <w:rStyle w:val="Style7"/>
+              </w:rPr>
+              <w:t>9.1 https://docs.espressif.com/projects/esp-idf/en/stable/esp32/get-started/index.html</w:t>
+              <w:tab/>
+              <w:t>9</w:t>
+            </w:r>
+          </w:hyperlink>
+        </w:p>
+        <w:p>
+          <w:pPr>
+            <w:pStyle w:val="TOC2"/>
+            <w:tabs>
+              <w:tab w:val="clear" w:pos="708"/>
+              <w:tab w:val="right" w:pos="9920" w:leader="dot"/>
+            </w:tabs>
+            <w:rPr/>
+          </w:pPr>
+          <w:hyperlink w:anchor="__RefHeading___Toc359_3911609550" w:tooltip="https://components.espressif.com/components/lvgl/lvgl/versions/9.5.0/readme">
+            <w:r>
+              <w:rPr>
+                <w:rStyle w:val="Style7"/>
+              </w:rPr>
+              <w:t>9.2 https://components.espressif.com/components/lvgl/lvgl/versions/9.5.0/readme</w:t>
+              <w:tab/>
+              <w:t>10</w:t>
+            </w:r>
+          </w:hyperlink>
+        </w:p>
+        <w:p>
+          <w:pPr>
+            <w:pStyle w:val="TOC2"/>
+            <w:tabs>
+              <w:tab w:val="clear" w:pos="708"/>
+              <w:tab w:val="right" w:pos="9920" w:leader="dot"/>
+            </w:tabs>
+            <w:rPr/>
+          </w:pPr>
+          <w:hyperlink w:anchor="__RefHeading___Toc361_3911609550" w:tooltip="https://docs.espressif.com/projects/esp-idf/en/stable/esp32/api-reference/peripherals/lcd/index.html">
+            <w:r>
+              <w:rPr>
+                <w:rStyle w:val="Style7"/>
+              </w:rPr>
+              <w:t>9.3 https://docs.espressif.com/projects/esp-idf/en/stable/esp32/api-reference/peripherals/lcd/index.html</w:t>
+              <w:tab/>
+              <w:t>10</w:t>
+            </w:r>
+          </w:hyperlink>
+        </w:p>
+        <w:p>
+          <w:pPr>
+            <w:pStyle w:val="TOC2"/>
+            <w:tabs>
+              <w:tab w:val="clear" w:pos="708"/>
+              <w:tab w:val="right" w:pos="9920" w:leader="dot"/>
+            </w:tabs>
+            <w:rPr/>
+          </w:pPr>
+          <w:hyperlink w:anchor="__RefHeading___Toc363_3911609550" w:tooltip="http://www.dsplib.ru/">
+            <w:r>
+              <w:rPr>
+                <w:rStyle w:val="Style7"/>
+              </w:rPr>
+              <w:t>9.4 http://www.dsplib.ru/</w:t>
+              <w:tab/>
+              <w:t>10</w:t>
+            </w:r>
+          </w:hyperlink>
+        </w:p>
+        <w:p>
+          <w:pPr>
+            <w:pStyle w:val="TOC2"/>
+            <w:tabs>
+              <w:tab w:val="clear" w:pos="708"/>
+              <w:tab w:val="right" w:pos="9920" w:leader="dot"/>
+            </w:tabs>
+            <w:rPr/>
+          </w:pPr>
+          <w:hyperlink w:anchor="__RefHeading___Toc365_3911609550" w:tooltip="https://sr.ht/~jmaselbas/wch-isp/">
+            <w:r>
+              <w:rPr>
+                <w:rStyle w:val="Style7"/>
+              </w:rPr>
+              <w:t>9.5 https://sr.ht/~jmaselbas/wch-isp/</w:t>
+              <w:tab/>
+              <w:t>10</w:t>
+            </w:r>
+          </w:hyperlink>
+        </w:p>
+        <w:p>
+          <w:pPr>
+            <w:pStyle w:val="TOC2"/>
+            <w:tabs>
+              <w:tab w:val="clear" w:pos="708"/>
+              <w:tab w:val="right" w:pos="9920" w:leader="dot"/>
+            </w:tabs>
+            <w:rPr/>
+          </w:pPr>
+          <w:hyperlink w:anchor="__RefHeading___Toc367_3911609550" w:tooltip="https://github.com/openwch/ch32v20x">
+            <w:r>
+              <w:rPr>
+                <w:rStyle w:val="Style7"/>
+              </w:rPr>
+              <w:t>9.6 https://github.com/openwch/ch32v20x</w:t>
+              <w:tab/>
+              <w:t>10</w:t>
+            </w:r>
+          </w:hyperlink>
+          <w:r>
             <w:rPr>
-              <w:rFonts w:ascii="Calibri" w:hAnsi="Calibri" w:eastAsia="" w:asciiTheme="minorHAnsi" w:eastAsiaTheme="minorEastAsia" w:hAnsiTheme="minorHAnsi"/>
-              <w:bCs w:val="false"/>
-              <w:sz w:val="22"/>
-              <w:szCs w:val="22"/>
-              <w:lang w:eastAsia="ru-RU"/>
+              <w:rStyle w:val="Style7"/>
             </w:rPr>
-          </w:pPr>
-          <w:r>
-            <w:rPr/>
-            <w:t>4 Выводы</w:t>
-            <w:tab/>
-            <w:t>13</w:t>
-          </w:r>
-          <w:r>
-            <w:rPr/>
             <w:fldChar w:fldCharType="end"/>
           </w:r>
         </w:p>
@@ -1282,6 +1643,8 @@
         <w:spacing w:before="0" w:after="0"/>
         <w:rPr/>
       </w:pPr>
+      <w:bookmarkStart w:id="5" w:name="__RefHeading___Toc305_3911609550"/>
+      <w:bookmarkEnd w:id="5"/>
       <w:r>
         <w:rPr/>
         <w:t>Введение</w:t>
@@ -1291,64 +1654,74 @@
       <w:pPr>
         <w:pStyle w:val="Normal"/>
         <w:rPr>
-          <w:rFonts w:ascii="TimesNewRomanPSMT" w:hAnsi="TimesNewRomanPSMT" w:eastAsia="Times New Roman" w:cs="Times New Roman"/>
+          <w:rFonts w:ascii="TimesNewRoman" w:hAnsi="TimesNewRoman"/>
+        </w:rPr>
+      </w:pPr>
+      <w:r>
+        <w:rPr>
+          <w:rFonts w:eastAsia="Times New Roman" w:cs="Times New Roman" w:ascii="TimesNewRoman" w:hAnsi="TimesNewRoman"/>
           <w:color w:val="000000"/>
         </w:rPr>
-      </w:pPr>
-      <w:r>
-        <w:rPr>
-          <w:rFonts w:eastAsia="Times New Roman" w:cs="Times New Roman" w:ascii="TimesNewRomanPSMT" w:hAnsi="TimesNewRomanPSMT"/>
+        <w:t>Назначение устройства.</w:t>
+      </w:r>
+    </w:p>
+    <w:p>
+      <w:pPr>
+        <w:pStyle w:val="Normal"/>
+        <w:rPr>
+          <w:rFonts w:ascii="TimesNewRoman" w:hAnsi="TimesNewRoman"/>
+        </w:rPr>
+      </w:pPr>
+      <w:r>
+        <w:rPr>
+          <w:rFonts w:eastAsia="Times New Roman" w:cs="Times New Roman" w:ascii="TimesNewRoman" w:hAnsi="TimesNewRoman"/>
           <w:color w:val="000000"/>
         </w:rPr>
-        <w:t>Назначение устройства.</w:t>
+        <w:t>Устройство предназначено для формирования и измерения синфазной и квадратурной составляющих сигнала в основной полосе частот. Выдачу на дисплей спекта измеряемого сигнала (водопада) и формирование составляющих сигнала для различного типа модуляций.</w:t>
       </w:r>
     </w:p>
     <w:p>
       <w:pPr>
         <w:pStyle w:val="Normal"/>
         <w:rPr>
-          <w:rFonts w:ascii="TimesNewRomanPSMT" w:hAnsi="TimesNewRomanPSMT" w:eastAsia="Times New Roman" w:cs="Times New Roman"/>
+          <w:rFonts w:ascii="TimesNewRoman" w:hAnsi="TimesNewRoman"/>
+        </w:rPr>
+      </w:pPr>
+      <w:r>
+        <w:rPr>
+          <w:rFonts w:eastAsia="Times New Roman" w:cs="Times New Roman" w:ascii="TimesNewRoman" w:hAnsi="TimesNewRoman"/>
           <w:color w:val="000000"/>
         </w:rPr>
-      </w:pPr>
-      <w:r>
-        <w:rPr>
-          <w:rFonts w:eastAsia="Times New Roman" w:cs="Times New Roman" w:ascii="TimesNewRomanPSMT" w:hAnsi="TimesNewRomanPSMT"/>
+        <w:t xml:space="preserve">Цель </w:t>
+      </w:r>
+      <w:r>
+        <w:rPr>
+          <w:rFonts w:eastAsia="Times New Roman" w:cs="Times New Roman" w:ascii="TimesNewRoman" w:hAnsi="TimesNewRoman"/>
           <w:color w:val="000000"/>
         </w:rPr>
-        <w:t>Устройство предназначено для формирования и измерения синфазной и квадратурной составляющих сигнала в основной полосе частот. Выдачу на дисплей спекта измеряемого сигнала (водопада) и формирование составляющих сигнала для различного типа модуляций.</w:t>
+        <w:t>разработки</w:t>
+      </w:r>
+      <w:r>
+        <w:rPr>
+          <w:rFonts w:eastAsia="Times New Roman" w:cs="Times New Roman" w:ascii="TimesNewRoman" w:hAnsi="TimesNewRoman"/>
+          <w:color w:val="000000"/>
+        </w:rPr>
+        <w:t>.</w:t>
       </w:r>
     </w:p>
     <w:p>
       <w:pPr>
         <w:pStyle w:val="Normal"/>
         <w:rPr>
-          <w:rFonts w:ascii="TimesNewRomanPSMT" w:hAnsi="TimesNewRomanPSMT" w:eastAsia="Times New Roman" w:cs="Times New Roman"/>
+          <w:rFonts w:ascii="TimesNewRoman" w:hAnsi="TimesNewRoman"/>
+        </w:rPr>
+      </w:pPr>
+      <w:r>
+        <w:rPr>
+          <w:rFonts w:eastAsia="Times New Roman" w:cs="Times New Roman" w:ascii="TimesNewRoman" w:hAnsi="TimesNewRoman"/>
           <w:color w:val="000000"/>
         </w:rPr>
-      </w:pPr>
-      <w:r>
-        <w:rPr>
-          <w:rFonts w:eastAsia="Times New Roman" w:cs="Times New Roman" w:ascii="TimesNewRomanPSMT" w:hAnsi="TimesNewRomanPSMT"/>
-          <w:color w:val="000000"/>
-        </w:rPr>
-        <w:t>Цель создания.</w:t>
-      </w:r>
-    </w:p>
-    <w:p>
-      <w:pPr>
-        <w:pStyle w:val="Normal"/>
-        <w:rPr>
-          <w:rFonts w:ascii="TimesNewRomanPSMT" w:hAnsi="TimesNewRomanPSMT" w:eastAsia="Times New Roman" w:cs="Times New Roman"/>
-          <w:color w:val="000000"/>
-        </w:rPr>
-      </w:pPr>
-      <w:r>
-        <w:rPr>
-          <w:rFonts w:eastAsia="Times New Roman" w:cs="Times New Roman" w:ascii="TimesNewRomanPSMT" w:hAnsi="TimesNewRomanPSMT"/>
-          <w:color w:val="000000"/>
-        </w:rPr>
-        <w:t>Главной целью данного устройства является получение унифицированной платформы для анализа квадратурных сигналов. Радиочастотная часть разрабатывается отдельно и может заменяться в зависимости от требуемых условий. Данное устройство будет интересно радиолюбителям для создания sdr платформ.</w:t>
+        <w:t>Главной целью данного устройства является получение унифицированной платформы для анализа квадратурных сигналов. Радиочастотная часть разрабатывается отдельно и может заменяться в зависимости от требуемых условий. Данное устройство будет интересно радиолюбителям для создания инструментов цифровой обработки сигналов.</w:t>
       </w:r>
     </w:p>
     <w:p>
@@ -1388,6 +1761,8 @@
         <w:spacing w:before="0" w:after="0"/>
         <w:rPr/>
       </w:pPr>
+      <w:bookmarkStart w:id="6" w:name="__RefHeading___Toc307_3911609550"/>
+      <w:bookmarkEnd w:id="6"/>
       <w:r>
         <w:rPr>
           <w:shd w:fill="FFFFFF" w:val="clear"/>
@@ -1402,11 +1777,279 @@
     <w:p>
       <w:pPr>
         <w:pStyle w:val="Normal"/>
-        <w:rPr/>
-      </w:pPr>
-      <w:r>
-        <w:rPr/>
+        <w:rPr>
+          <w:sz w:val="28"/>
+          <w:szCs w:val="28"/>
+        </w:rPr>
+      </w:pPr>
+      <w:r>
+        <w:rPr>
+          <w:sz w:val="28"/>
+          <w:szCs w:val="28"/>
+        </w:rPr>
         <w:t>Основные технические характеристики устройства:</w:t>
+      </w:r>
+    </w:p>
+    <w:p>
+      <w:pPr>
+        <w:pStyle w:val="df3vjf"/>
+        <w:widowControl/>
+        <w:numPr>
+          <w:ilvl w:val="0"/>
+          <w:numId w:val="4"/>
+        </w:numPr>
+        <w:shd w:val="clear" w:color="auto" w:fill="FFFFFF"/>
+        <w:bidi w:val="0"/>
+        <w:spacing w:lineRule="atLeast" w:line="360" w:beforeAutospacing="0" w:before="0" w:afterAutospacing="0" w:after="0"/>
+        <w:rPr/>
+      </w:pPr>
+      <w:r>
+        <w:rPr>
+          <w:rStyle w:val="Strong"/>
+          <w:rFonts w:eastAsia="" w:cs="Arial" w:ascii="Times New Roman" w:hAnsi="Times New Roman" w:eastAsiaTheme="majorEastAsia"/>
+          <w:b w:val="false"/>
+          <w:bCs w:val="false"/>
+          <w:color w:val="0A0A0A"/>
+          <w:kern w:val="0"/>
+          <w:sz w:val="28"/>
+          <w:szCs w:val="28"/>
+          <w:lang w:val="ru-RU" w:bidi="ar-SA"/>
+        </w:rPr>
+        <w:t xml:space="preserve">Полоса частот </w:t>
+      </w:r>
+      <w:r>
+        <w:rPr>
+          <w:rStyle w:val="Strong"/>
+          <w:rFonts w:eastAsia="" w:cs="Arial" w:ascii="Times New Roman" w:hAnsi="Times New Roman" w:eastAsiaTheme="majorEastAsia"/>
+          <w:b w:val="false"/>
+          <w:bCs w:val="false"/>
+          <w:color w:val="0A0A0A"/>
+          <w:kern w:val="0"/>
+          <w:sz w:val="28"/>
+          <w:szCs w:val="28"/>
+          <w:lang w:val="ru-RU" w:bidi="ar-SA"/>
+        </w:rPr>
+        <w:t>формируемых</w:t>
+      </w:r>
+      <w:r>
+        <w:rPr>
+          <w:rStyle w:val="Strong"/>
+          <w:rFonts w:eastAsia="" w:cs="Arial" w:ascii="Times New Roman" w:hAnsi="Times New Roman" w:eastAsiaTheme="majorEastAsia"/>
+          <w:b w:val="false"/>
+          <w:bCs w:val="false"/>
+          <w:color w:val="0A0A0A"/>
+          <w:kern w:val="0"/>
+          <w:sz w:val="28"/>
+          <w:szCs w:val="28"/>
+          <w:lang w:val="ru-RU" w:bidi="ar-SA"/>
+        </w:rPr>
+        <w:t xml:space="preserve"> сигналов:</w:t>
+      </w:r>
+    </w:p>
+    <w:p>
+      <w:pPr>
+        <w:pStyle w:val="df3vjf"/>
+        <w:widowControl/>
+        <w:numPr>
+          <w:ilvl w:val="0"/>
+          <w:numId w:val="4"/>
+        </w:numPr>
+        <w:shd w:val="clear" w:color="auto" w:fill="FFFFFF"/>
+        <w:bidi w:val="0"/>
+        <w:spacing w:lineRule="atLeast" w:line="360" w:beforeAutospacing="0" w:before="0" w:afterAutospacing="0" w:after="0"/>
+        <w:rPr/>
+      </w:pPr>
+      <w:r>
+        <w:rPr>
+          <w:rStyle w:val="Strong"/>
+          <w:rFonts w:eastAsia="" w:cs="Arial" w:ascii="Times New Roman" w:hAnsi="Times New Roman" w:eastAsiaTheme="majorEastAsia"/>
+          <w:b w:val="false"/>
+          <w:bCs w:val="false"/>
+          <w:color w:val="0A0A0A"/>
+          <w:kern w:val="0"/>
+          <w:sz w:val="28"/>
+          <w:szCs w:val="28"/>
+          <w:lang w:val="ru-RU" w:bidi="ar-SA"/>
+        </w:rPr>
+        <w:t>Полоса частот формируемых сигналов (Baseband Bandwidth): 0 – 190  кГц.</w:t>
+      </w:r>
+    </w:p>
+    <w:p>
+      <w:pPr>
+        <w:pStyle w:val="df3vjf"/>
+        <w:widowControl/>
+        <w:numPr>
+          <w:ilvl w:val="0"/>
+          <w:numId w:val="4"/>
+        </w:numPr>
+        <w:shd w:val="clear" w:color="auto" w:fill="FFFFFF"/>
+        <w:bidi w:val="0"/>
+        <w:spacing w:lineRule="atLeast" w:line="360" w:beforeAutospacing="0" w:before="0" w:afterAutospacing="0" w:after="0"/>
+        <w:rPr/>
+      </w:pPr>
+      <w:r>
+        <w:rPr>
+          <w:rStyle w:val="Strong"/>
+          <w:rFonts w:eastAsia="" w:cs="Arial" w:ascii="Times New Roman" w:hAnsi="Times New Roman" w:eastAsiaTheme="majorEastAsia"/>
+          <w:b w:val="false"/>
+          <w:bCs w:val="false"/>
+          <w:color w:val="0A0A0A"/>
+          <w:kern w:val="0"/>
+          <w:sz w:val="28"/>
+          <w:szCs w:val="28"/>
+          <w:lang w:val="ru-RU" w:bidi="ar-SA"/>
+        </w:rPr>
+        <w:t xml:space="preserve">Неравномерность АЧХ в полосе: (например, ±0.02 дБ). </w:t>
+      </w:r>
+    </w:p>
+    <w:p>
+      <w:pPr>
+        <w:pStyle w:val="df3vjf"/>
+        <w:widowControl/>
+        <w:numPr>
+          <w:ilvl w:val="0"/>
+          <w:numId w:val="4"/>
+        </w:numPr>
+        <w:shd w:val="clear" w:color="auto" w:fill="FFFFFF"/>
+        <w:bidi w:val="0"/>
+        <w:spacing w:lineRule="atLeast" w:line="360" w:beforeAutospacing="0" w:before="0" w:afterAutospacing="0" w:after="0"/>
+        <w:rPr/>
+      </w:pPr>
+      <w:r>
+        <w:rPr>
+          <w:rStyle w:val="Strong"/>
+          <w:rFonts w:eastAsia="" w:cs="Arial" w:ascii="Times New Roman" w:hAnsi="Times New Roman" w:eastAsiaTheme="majorEastAsia"/>
+          <w:b w:val="false"/>
+          <w:bCs w:val="false"/>
+          <w:color w:val="0A0A0A"/>
+          <w:kern w:val="0"/>
+          <w:sz w:val="28"/>
+          <w:szCs w:val="28"/>
+          <w:lang w:val="ru-RU" w:bidi="ar-SA"/>
+        </w:rPr>
+        <w:t>Частота дискретизации ЦАП: 384 кГц.</w:t>
+      </w:r>
+    </w:p>
+    <w:p>
+      <w:pPr>
+        <w:pStyle w:val="df3vjf"/>
+        <w:widowControl/>
+        <w:numPr>
+          <w:ilvl w:val="0"/>
+          <w:numId w:val="4"/>
+        </w:numPr>
+        <w:shd w:val="clear" w:color="auto" w:fill="FFFFFF"/>
+        <w:bidi w:val="0"/>
+        <w:spacing w:lineRule="atLeast" w:line="360" w:beforeAutospacing="0" w:before="0" w:afterAutospacing="0" w:after="0"/>
+        <w:rPr/>
+      </w:pPr>
+      <w:r>
+        <w:rPr>
+          <w:rStyle w:val="Strong"/>
+          <w:rFonts w:eastAsia="" w:cs="Arial" w:ascii="Times New Roman" w:hAnsi="Times New Roman" w:eastAsiaTheme="majorEastAsia"/>
+          <w:b w:val="false"/>
+          <w:bCs w:val="false"/>
+          <w:color w:val="0A0A0A"/>
+          <w:kern w:val="0"/>
+          <w:sz w:val="28"/>
+          <w:szCs w:val="28"/>
+          <w:lang w:val="ru-RU" w:bidi="ar-SA"/>
+        </w:rPr>
+        <w:t>Разбаланс амплитуд и фаз между каналами I и Q:</w:t>
+      </w:r>
+    </w:p>
+    <w:p>
+      <w:pPr>
+        <w:pStyle w:val="df3vjf"/>
+        <w:widowControl/>
+        <w:numPr>
+          <w:ilvl w:val="0"/>
+          <w:numId w:val="4"/>
+        </w:numPr>
+        <w:shd w:val="clear" w:color="auto" w:fill="FFFFFF"/>
+        <w:bidi w:val="0"/>
+        <w:spacing w:lineRule="atLeast" w:line="360" w:beforeAutospacing="0" w:before="0" w:afterAutospacing="0" w:after="0"/>
+        <w:rPr/>
+      </w:pPr>
+      <w:r>
+        <w:rPr>
+          <w:rStyle w:val="Strong"/>
+          <w:rFonts w:eastAsia="" w:cs="Arial" w:ascii="Times New Roman" w:hAnsi="Times New Roman" w:eastAsiaTheme="majorEastAsia"/>
+          <w:b w:val="false"/>
+          <w:bCs w:val="false"/>
+          <w:color w:val="0A0A0A"/>
+          <w:kern w:val="0"/>
+          <w:sz w:val="28"/>
+          <w:szCs w:val="28"/>
+          <w:lang w:val="ru-RU" w:bidi="ar-SA"/>
+        </w:rPr>
+        <w:t>Амплитудный: &lt; 0.1 дБ.</w:t>
+      </w:r>
+    </w:p>
+    <w:p>
+      <w:pPr>
+        <w:pStyle w:val="df3vjf"/>
+        <w:widowControl/>
+        <w:numPr>
+          <w:ilvl w:val="0"/>
+          <w:numId w:val="4"/>
+        </w:numPr>
+        <w:shd w:val="clear" w:color="auto" w:fill="FFFFFF"/>
+        <w:bidi w:val="0"/>
+        <w:spacing w:lineRule="atLeast" w:line="360" w:beforeAutospacing="0" w:before="0" w:afterAutospacing="0" w:after="0"/>
+        <w:rPr/>
+      </w:pPr>
+      <w:r>
+        <w:rPr>
+          <w:rStyle w:val="Strong"/>
+          <w:rFonts w:eastAsia="" w:cs="Arial" w:ascii="Times New Roman" w:hAnsi="Times New Roman" w:eastAsiaTheme="majorEastAsia"/>
+          <w:b w:val="false"/>
+          <w:bCs w:val="false"/>
+          <w:color w:val="0A0A0A"/>
+          <w:kern w:val="0"/>
+          <w:sz w:val="28"/>
+          <w:szCs w:val="28"/>
+          <w:lang w:val="ru-RU" w:bidi="ar-SA"/>
+        </w:rPr>
+        <w:t>Фазовый: &lt; 0,1°.</w:t>
+      </w:r>
+    </w:p>
+    <w:p>
+      <w:pPr>
+        <w:pStyle w:val="df3vjf"/>
+        <w:widowControl/>
+        <w:numPr>
+          <w:ilvl w:val="0"/>
+          <w:numId w:val="4"/>
+        </w:numPr>
+        <w:shd w:val="clear" w:color="auto" w:fill="FFFFFF"/>
+        <w:bidi w:val="0"/>
+        <w:spacing w:lineRule="atLeast" w:line="360" w:beforeAutospacing="0" w:before="0" w:afterAutospacing="0" w:after="0"/>
+        <w:rPr/>
+      </w:pPr>
+      <w:r>
+        <w:rPr>
+          <w:rStyle w:val="Strong"/>
+          <w:rFonts w:eastAsia="" w:cs="Arial" w:ascii="Times New Roman" w:hAnsi="Times New Roman" w:eastAsiaTheme="majorEastAsia"/>
+          <w:b w:val="false"/>
+          <w:bCs w:val="false"/>
+          <w:color w:val="0A0A0A"/>
+          <w:kern w:val="0"/>
+          <w:sz w:val="28"/>
+          <w:szCs w:val="28"/>
+          <w:lang w:val="ru-RU" w:bidi="ar-SA"/>
+        </w:rPr>
+        <w:t>Уровень подавления зеркального канала и несущей: (в дБн). Показывает качество формирования квадратур.</w:t>
+      </w:r>
+    </w:p>
+    <w:p>
+      <w:pPr>
+        <w:pStyle w:val="ListParagraph"/>
+        <w:ind w:hanging="0" w:start="927"/>
+        <w:rPr/>
+      </w:pPr>
+      <w:r>
+        <w:rPr/>
       </w:r>
     </w:p>
     <w:p>
@@ -1420,280 +2063,6 @@
       </w:pPr>
       <w:r>
         <w:rPr/>
-        <w:t>Полоса частот формируемых сигналов:</w:t>
-      </w:r>
-    </w:p>
-    <w:p>
-      <w:pPr>
-        <w:pStyle w:val="df3vjf"/>
-        <w:numPr>
-          <w:ilvl w:val="0"/>
-          <w:numId w:val="4"/>
-        </w:numPr>
-        <w:shd w:val="clear" w:color="auto" w:fill="FFFFFF"/>
-        <w:spacing w:lineRule="atLeast" w:line="360" w:beforeAutospacing="0" w:before="0" w:afterAutospacing="0" w:after="0"/>
-        <w:rPr>
-          <w:rFonts w:ascii="Arial" w:hAnsi="Arial" w:cs="Arial"/>
-          <w:color w:val="0A0A0A"/>
-        </w:rPr>
-      </w:pPr>
-      <w:r>
-        <w:rPr>
-          <w:rStyle w:val="Strong"/>
-          <w:rFonts w:eastAsia="" w:cs="Arial" w:ascii="Arial" w:hAnsi="Arial" w:eastAsiaTheme="majorEastAsia"/>
-          <w:b w:val="false"/>
-          <w:bCs w:val="false"/>
-          <w:color w:val="0A0A0A"/>
-        </w:rPr>
-        <w:t>Полоса частот формируемых сигналов (Baseband Bandwidth):</w:t>
-      </w:r>
-      <w:r>
-        <w:rPr>
-          <w:rStyle w:val="t286pc"/>
-          <w:rFonts w:eastAsia="" w:cs="Arial" w:ascii="Arial" w:hAnsi="Arial" w:eastAsiaTheme="majorEastAsia"/>
-          <w:b w:val="false"/>
-          <w:bCs w:val="false"/>
-          <w:color w:val="0A0A0A"/>
-        </w:rPr>
-        <w:t> 0 – 190  кГц</w:t>
-      </w:r>
-      <w:r>
-        <w:rPr>
-          <w:rStyle w:val="t286pc"/>
-          <w:rFonts w:eastAsia="" w:cs="Arial" w:ascii="Arial" w:hAnsi="Arial" w:eastAsiaTheme="majorEastAsia"/>
-          <w:color w:val="0A0A0A"/>
-        </w:rPr>
-        <w:t>.</w:t>
-      </w:r>
-    </w:p>
-    <w:p>
-      <w:pPr>
-        <w:pStyle w:val="df3vjf"/>
-        <w:numPr>
-          <w:ilvl w:val="0"/>
-          <w:numId w:val="4"/>
-        </w:numPr>
-        <w:shd w:val="clear" w:color="auto" w:fill="FFFFFF"/>
-        <w:spacing w:lineRule="atLeast" w:line="360" w:beforeAutospacing="0" w:before="0" w:afterAutospacing="0" w:after="0"/>
-        <w:rPr>
-          <w:rFonts w:ascii="Arial" w:hAnsi="Arial" w:cs="Arial"/>
-          <w:color w:val="0A0A0A"/>
-        </w:rPr>
-      </w:pPr>
-      <w:r>
-        <w:rPr>
-          <w:rStyle w:val="Strong"/>
-          <w:rFonts w:eastAsia="" w:cs="Arial" w:ascii="Arial" w:hAnsi="Arial" w:eastAsiaTheme="majorEastAsia"/>
-          <w:b w:val="false"/>
-          <w:bCs w:val="false"/>
-          <w:color w:val="0A0A0A"/>
-        </w:rPr>
-        <w:t>Неравномерность АЧХ в полосе:</w:t>
-      </w:r>
-      <w:r>
-        <w:rPr>
-          <w:rStyle w:val="t286pc"/>
-          <w:rFonts w:eastAsia="" w:cs="Arial" w:ascii="Arial" w:hAnsi="Arial" w:eastAsiaTheme="majorEastAsia"/>
-          <w:b w:val="false"/>
-          <w:bCs w:val="false"/>
-          <w:color w:val="0A0A0A"/>
-        </w:rPr>
-        <w:t> (например, ±0.02 дБ).</w:t>
-      </w:r>
-      <w:r>
-        <w:rPr>
-          <w:rStyle w:val="t286pc"/>
-          <w:rFonts w:eastAsia="" w:cs="Arial" w:ascii="Arial" w:hAnsi="Arial" w:eastAsiaTheme="majorEastAsia"/>
-          <w:color w:val="0A0A0A"/>
-        </w:rPr>
-        <w:t xml:space="preserve"> </w:t>
-      </w:r>
-    </w:p>
-    <w:p>
-      <w:pPr>
-        <w:pStyle w:val="df3vjf"/>
-        <w:numPr>
-          <w:ilvl w:val="0"/>
-          <w:numId w:val="4"/>
-        </w:numPr>
-        <w:shd w:val="clear" w:color="auto" w:fill="FFFFFF"/>
-        <w:spacing w:lineRule="atLeast" w:line="360" w:beforeAutospacing="0" w:before="0" w:afterAutospacing="0" w:after="0"/>
-        <w:rPr/>
-      </w:pPr>
-      <w:r>
-        <w:rPr>
-          <w:rStyle w:val="Strong"/>
-          <w:rFonts w:eastAsia="" w:cs="Arial" w:ascii="Arial" w:hAnsi="Arial" w:eastAsiaTheme="majorEastAsia"/>
-          <w:b w:val="false"/>
-          <w:bCs w:val="false"/>
-          <w:color w:val="0A0A0A"/>
-        </w:rPr>
-        <w:t>Частота дискретизации ЦАП:</w:t>
-      </w:r>
-      <w:r>
-        <w:rPr>
-          <w:rStyle w:val="t286pc"/>
-          <w:rFonts w:eastAsia="" w:cs="Arial" w:ascii="Arial" w:hAnsi="Arial" w:eastAsiaTheme="majorEastAsia"/>
-          <w:b w:val="false"/>
-          <w:bCs w:val="false"/>
-          <w:color w:val="0A0A0A"/>
-        </w:rPr>
-        <w:t> </w:t>
-      </w:r>
-      <w:r>
-        <w:rPr>
-          <w:rStyle w:val="t286pc"/>
-          <w:rFonts w:eastAsia="" w:cs="Arial" w:ascii="Arial" w:hAnsi="Arial" w:eastAsiaTheme="majorEastAsia"/>
-          <w:b w:val="false"/>
-          <w:bCs w:val="false"/>
-          <w:color w:val="0A0A0A"/>
-          <w:lang w:val="en-US"/>
-        </w:rPr>
-        <w:t xml:space="preserve">384 </w:t>
-      </w:r>
-      <w:r>
-        <w:rPr>
-          <w:rStyle w:val="t286pc"/>
-          <w:rFonts w:eastAsia="" w:cs="Arial" w:ascii="Arial" w:hAnsi="Arial" w:eastAsiaTheme="majorEastAsia"/>
-          <w:b w:val="false"/>
-          <w:bCs w:val="false"/>
-          <w:color w:val="0A0A0A"/>
-        </w:rPr>
-        <w:t>кГц.</w:t>
-      </w:r>
-    </w:p>
-    <w:p>
-      <w:pPr>
-        <w:pStyle w:val="df3vjf"/>
-        <w:numPr>
-          <w:ilvl w:val="0"/>
-          <w:numId w:val="4"/>
-        </w:numPr>
-        <w:shd w:val="clear" w:color="auto" w:fill="FFFFFF"/>
-        <w:spacing w:lineRule="atLeast" w:line="360" w:beforeAutospacing="0" w:before="0" w:afterAutospacing="0" w:after="0"/>
-        <w:rPr/>
-      </w:pPr>
-      <w:r>
-        <w:rPr>
-          <w:rStyle w:val="Strong"/>
-          <w:rFonts w:eastAsia="" w:cs="Arial" w:ascii="Arial" w:hAnsi="Arial" w:eastAsiaTheme="majorEastAsia"/>
-          <w:b w:val="false"/>
-          <w:bCs w:val="false"/>
-          <w:color w:val="0A0A0A"/>
-        </w:rPr>
-        <w:t>Разбаланс амплитуд и фаз между каналами I и Q:</w:t>
-      </w:r>
-    </w:p>
-    <w:p>
-      <w:pPr>
-        <w:pStyle w:val="df3vjf"/>
-        <w:numPr>
-          <w:ilvl w:val="0"/>
-          <w:numId w:val="4"/>
-        </w:numPr>
-        <w:shd w:val="clear" w:color="auto" w:fill="FFFFFF"/>
-        <w:spacing w:lineRule="atLeast" w:line="360" w:beforeAutospacing="0" w:before="0" w:afterAutospacing="0" w:after="0"/>
-        <w:rPr>
-          <w:rFonts w:ascii="Arial" w:hAnsi="Arial" w:cs="Arial"/>
-          <w:color w:val="0A0A0A"/>
-        </w:rPr>
-      </w:pPr>
-      <w:r>
-        <w:rPr>
-          <w:rStyle w:val="t286pc"/>
-          <w:rFonts w:eastAsia="" w:cs="Arial" w:ascii="Arial" w:hAnsi="Arial" w:eastAsiaTheme="majorEastAsia"/>
-          <w:color w:val="0A0A0A"/>
-        </w:rPr>
-        <w:t>Амплитудный: &lt; 0.1 дБ.</w:t>
-      </w:r>
-    </w:p>
-    <w:p>
-      <w:pPr>
-        <w:pStyle w:val="df3vjf"/>
-        <w:numPr>
-          <w:ilvl w:val="0"/>
-          <w:numId w:val="4"/>
-        </w:numPr>
-        <w:shd w:val="clear" w:color="auto" w:fill="FFFFFF"/>
-        <w:spacing w:lineRule="atLeast" w:line="360" w:beforeAutospacing="0" w:before="0" w:afterAutospacing="0" w:after="0"/>
-        <w:rPr>
-          <w:rFonts w:ascii="Arial" w:hAnsi="Arial" w:cs="Arial"/>
-          <w:color w:val="0A0A0A"/>
-        </w:rPr>
-      </w:pPr>
-      <w:r>
-        <w:rPr>
-          <w:rStyle w:val="t286pc"/>
-          <w:rFonts w:eastAsia="" w:cs="Arial" w:ascii="Arial" w:hAnsi="Arial" w:eastAsiaTheme="majorEastAsia"/>
-          <w:color w:val="0A0A0A"/>
-        </w:rPr>
-        <w:t>Фазовый: &lt; 0,1°.</w:t>
-      </w:r>
-    </w:p>
-    <w:p>
-      <w:pPr>
-        <w:pStyle w:val="df3vjf"/>
-        <w:numPr>
-          <w:ilvl w:val="0"/>
-          <w:numId w:val="4"/>
-        </w:numPr>
-        <w:shd w:val="clear" w:color="auto" w:fill="FFFFFF"/>
-        <w:spacing w:lineRule="atLeast" w:line="360" w:beforeAutospacing="0" w:before="0" w:afterAutospacing="0" w:after="180"/>
-        <w:rPr>
-          <w:rFonts w:ascii="Arial" w:hAnsi="Arial" w:cs="Arial"/>
-          <w:color w:val="0A0A0A"/>
-        </w:rPr>
-      </w:pPr>
-      <w:r>
-        <w:rPr>
-          <w:rStyle w:val="Strong"/>
-          <w:rFonts w:eastAsia="" w:cs="Arial" w:ascii="Arial" w:hAnsi="Arial" w:eastAsiaTheme="majorEastAsia"/>
-          <w:b w:val="false"/>
-          <w:bCs w:val="false"/>
-          <w:color w:val="0A0A0A"/>
-        </w:rPr>
-        <w:t>Уровень подавления зеркального канала и несущей:</w:t>
-      </w:r>
-      <w:r>
-        <w:rPr>
-          <w:rStyle w:val="t286pc"/>
-          <w:rFonts w:eastAsia="" w:cs="Arial" w:ascii="Arial" w:hAnsi="Arial" w:eastAsiaTheme="majorEastAsia"/>
-          <w:b w:val="false"/>
-          <w:bCs w:val="false"/>
-          <w:color w:val="0A0A0A"/>
-        </w:rPr>
-        <w:t> (в дБн).</w:t>
-      </w:r>
-      <w:r>
-        <w:rPr>
-          <w:rStyle w:val="t286pc"/>
-          <w:rFonts w:eastAsia="" w:cs="Arial" w:ascii="Arial" w:hAnsi="Arial" w:eastAsiaTheme="majorEastAsia"/>
-          <w:color w:val="0A0A0A"/>
-        </w:rPr>
-        <w:t xml:space="preserve"> Показывает качество формирования квадратур.</w:t>
-      </w:r>
-    </w:p>
-    <w:p>
-      <w:pPr>
-        <w:pStyle w:val="ListParagraph"/>
-        <w:ind w:hanging="0" w:start="927"/>
-        <w:rPr/>
-      </w:pPr>
-      <w:r>
-        <w:rPr/>
-      </w:r>
-    </w:p>
-    <w:p>
-      <w:pPr>
-        <w:pStyle w:val="ListParagraph"/>
-        <w:numPr>
-          <w:ilvl w:val="0"/>
-          <w:numId w:val="2"/>
-        </w:numPr>
-        <w:rPr/>
-      </w:pPr>
-      <w:r>
-        <w:rPr/>
         <w:t>Виды модуляции и демодуляции:</w:t>
       </w:r>
     </w:p>
@@ -1708,7 +2077,11 @@
       </w:pPr>
       <w:r>
         <w:rPr/>
-        <w:t>аналоговая: амплитудная, фазовая, частотная.</w:t>
+        <w:t xml:space="preserve">аналоговая: амплитудная, фазовая, частотная, </w:t>
+      </w:r>
+      <w:r>
+        <w:rPr/>
+        <w:t>амплитудная с верхней боковой полосой (USB), амплитудная с нижней боковой полосой (SSB).</w:t>
       </w:r>
     </w:p>
     <w:p>
@@ -1724,12 +2097,18 @@
         <w:rPr/>
         <w:t xml:space="preserve">цифровая: </w:t>
       </w:r>
+      <w:r>
+        <w:rPr/>
+        <w:t>амплитудная, частотная, фазовая манипуляция.</w:t>
+      </w:r>
     </w:p>
     <w:p>
       <w:pPr>
         <w:pStyle w:val="Heading1"/>
         <w:rPr/>
       </w:pPr>
+      <w:bookmarkStart w:id="7" w:name="__RefHeading___Toc309_3911609550"/>
+      <w:bookmarkEnd w:id="7"/>
       <w:r>
         <w:rPr>
           <w:shd w:fill="FFFFFF" w:val="clear"/>
@@ -1744,7 +2123,13 @@
         <w:rPr>
           <w:shd w:fill="FFFFFF" w:val="clear"/>
         </w:rPr>
-        <w:t xml:space="preserve"> структурной схемы</w:t>
+        <w:t xml:space="preserve"> </w:t>
+      </w:r>
+      <w:r>
+        <w:rPr>
+          <w:shd w:fill="FFFFFF" w:val="clear"/>
+        </w:rPr>
+        <w:t>компонентов</w:t>
       </w:r>
     </w:p>
     <w:p>
@@ -1771,7 +2156,7 @@
         <w:rPr>
           <w:rStyle w:val="Char"/>
         </w:rPr>
-        <w:t xml:space="preserve"> схема устройства представлена в документе 1220200037474.468173.000 Э2.  </w:t>
+        <w:t xml:space="preserve"> схема устройства представлена в документе 1220200037474.468173.000 Э2. </w:t>
       </w:r>
     </w:p>
     <w:p>
@@ -1793,7 +2178,15 @@
       </w:r>
       <w:r>
         <w:rPr/>
-        <w:t>ESP32-S3-WROOM-1. Выбор данного микроконтроллера обусловлен следующими факторами:</w:t>
+        <w:t xml:space="preserve">ESP32-S3-WROOM-1 </w:t>
+      </w:r>
+      <w:r>
+        <w:rPr/>
+        <w:t>(далее МК1)</w:t>
+      </w:r>
+      <w:r>
+        <w:rPr/>
+        <w:t>. Выбор данного микроконтроллера обусловлен следующими факторами:</w:t>
       </w:r>
     </w:p>
     <w:p>
@@ -1869,52 +2262,37 @@
     <w:p>
       <w:pPr>
         <w:pStyle w:val="11111"/>
-        <w:ind w:firstLine="709"/>
-        <w:rPr/>
-      </w:pPr>
-      <w:r>
-        <w:rPr/>
-        <w:t xml:space="preserve">Схема формирования квадратурных составляющих сигнала собрана на ЦАП </w:t>
-      </w:r>
-      <w:r>
-        <w:rPr>
-          <w:lang w:val="en-US"/>
-        </w:rPr>
-        <w:t>Texas</w:t>
-      </w:r>
-      <w:r>
-        <w:rPr/>
-        <w:t xml:space="preserve"> Instruments PCM5102</w:t>
-      </w:r>
-      <w:r>
-        <w:rPr>
-          <w:lang w:val="en-US"/>
-        </w:rPr>
-        <w:t>A</w:t>
-      </w:r>
-      <w:r>
-        <w:rPr/>
-        <w:t xml:space="preserve">. Микросхема ЦАП управляется по шине </w:t>
-      </w:r>
-      <w:r>
-        <w:rPr>
-          <w:lang w:val="en-US"/>
-        </w:rPr>
-        <w:t>I</w:t>
-      </w:r>
-      <w:r>
-        <w:rPr/>
-        <w:t>2</w:t>
-      </w:r>
-      <w:r>
-        <w:rPr>
-          <w:lang w:val="en-US"/>
-        </w:rPr>
-        <w:t>S</w:t>
-      </w:r>
-      <w:r>
-        <w:rPr/>
-        <w:t>. 4-х проводная шина для аудио. Основные данные микросхемы: частота дискретизации = 384 кГц Данная микросхема ЦАП обеспечивает достаточную линейность в полосе пропускания.</w:t>
+        <w:numPr>
+          <w:ilvl w:val="0"/>
+          <w:numId w:val="5"/>
+        </w:numPr>
+        <w:rPr/>
+      </w:pPr>
+      <w:r>
+        <w:rPr/>
+        <w:t>Встроенный с</w:t>
+      </w:r>
+      <w:r>
+        <w:rPr/>
+        <w:t xml:space="preserve">пециализированный периферийный модуль </w:t>
+      </w:r>
+      <w:r>
+        <w:rPr>
+          <w:rStyle w:val="Strong"/>
+          <w:rFonts w:ascii="Google Sans;Arial;sans-serif" w:hAnsi="Google Sans;Arial;sans-serif"/>
+          <w:b w:val="false"/>
+          <w:bCs w:val="false"/>
+          <w:strike w:val="false"/>
+          <w:dstrike w:val="false"/>
+          <w:sz w:val="24"/>
+          <w:u w:val="none"/>
+          <w:effect w:val="none"/>
+        </w:rPr>
+        <w:t>LCD_CAM</w:t>
+      </w:r>
+      <w:r>
+        <w:rPr/>
+        <w:t>, который предназначен для прямого управления дисплеями.</w:t>
       </w:r>
     </w:p>
     <w:p>
@@ -1925,7 +2303,7 @@
       </w:pPr>
       <w:r>
         <w:rPr/>
-        <w:t xml:space="preserve">Схема измерения квадратурных составляющих сигнала собрана на АЦП </w:t>
+        <w:t xml:space="preserve">Схема формирования квадратурных составляющих сигнала собрана на ЦАП </w:t>
       </w:r>
       <w:r>
         <w:rPr>
@@ -1935,17 +2313,17 @@
       </w:r>
       <w:r>
         <w:rPr/>
-        <w:t xml:space="preserve"> Instruments PCM</w:t>
+        <w:t xml:space="preserve"> Instruments PCM5102</w:t>
       </w:r>
       <w:r>
         <w:rPr>
           <w:lang w:val="en-US"/>
         </w:rPr>
-        <w:t>1804</w:t>
-      </w:r>
-      <w:r>
-        <w:rPr/>
-        <w:t xml:space="preserve">. Микросхема АЦП управляется по шине </w:t>
+        <w:t>A</w:t>
+      </w:r>
+      <w:r>
+        <w:rPr/>
+        <w:t xml:space="preserve">. Микросхема ЦАП управляется по шине </w:t>
       </w:r>
       <w:r>
         <w:rPr>
@@ -1965,7 +2343,7 @@
       </w:r>
       <w:r>
         <w:rPr/>
-        <w:t xml:space="preserve">. 4-х проводная шина для аудио. Основные параметры микросхемы: частота дискретизации до 192 кГц. </w:t>
+        <w:t>. 4-х проводная шина для аудио. Основные данные микросхемы: частота дискретизации = 384 кГц Данная микросхема ЦАП обеспечивает достаточную линейность в полосе пропускания.</w:t>
       </w:r>
     </w:p>
     <w:p>
@@ -1976,7 +2354,47 @@
       </w:pPr>
       <w:r>
         <w:rPr/>
-        <w:t>Дисплей. Может быть использован TFT LCD дисплей из следующего ряда (ili9341 (320*240), ili9486 (480*320)). Дисплей подключается к esp32s3 посредством параллельной 8 битной шины i8080. Питание дисплея 5 В и 3.3 В.</w:t>
+        <w:t xml:space="preserve">Схема измерения квадратурных составляющих сигнала собрана на АЦП </w:t>
+      </w:r>
+      <w:r>
+        <w:rPr>
+          <w:lang w:val="en-US"/>
+        </w:rPr>
+        <w:t>Texas</w:t>
+      </w:r>
+      <w:r>
+        <w:rPr/>
+        <w:t xml:space="preserve"> Instruments PCM</w:t>
+      </w:r>
+      <w:r>
+        <w:rPr>
+          <w:lang w:val="en-US"/>
+        </w:rPr>
+        <w:t>1804</w:t>
+      </w:r>
+      <w:r>
+        <w:rPr/>
+        <w:t xml:space="preserve">. Микросхема АЦП управляется по шине </w:t>
+      </w:r>
+      <w:r>
+        <w:rPr>
+          <w:lang w:val="en-US"/>
+        </w:rPr>
+        <w:t>I</w:t>
+      </w:r>
+      <w:r>
+        <w:rPr/>
+        <w:t>2</w:t>
+      </w:r>
+      <w:r>
+        <w:rPr>
+          <w:lang w:val="en-US"/>
+        </w:rPr>
+        <w:t>S</w:t>
+      </w:r>
+      <w:r>
+        <w:rPr/>
+        <w:t>. 4-х проводная шина для аудио. Основные параметры микросхемы: частота дискретизации до 192 кГц.</w:t>
       </w:r>
     </w:p>
     <w:p>
@@ -1987,7 +2405,27 @@
       </w:pPr>
       <w:r>
         <w:rPr/>
-        <w:t>Подчиненный микроконтроллер (сh32v203) обеспечивает опрос кнопок и энкодеров. Соединяется с esp32s3 посредством интерфейса UART.</w:t>
+        <w:t>ФНЧ фильтр перед АЦП и после ЦАП для подавления высокочастотных компонент</w:t>
+      </w:r>
+      <w:r>
+        <w:rPr/>
+        <w:t>ов</w:t>
+      </w:r>
+      <w:r>
+        <w:rPr/>
+        <w:t xml:space="preserve"> дискретизации </w:t>
+      </w:r>
+      <w:r>
+        <w:rPr/>
+        <w:t>сигнала</w:t>
+      </w:r>
+      <w:r>
+        <w:rPr/>
+        <w:t xml:space="preserve">. </w:t>
+      </w:r>
+      <w:r>
+        <w:rPr/>
+        <w:t xml:space="preserve"> </w:t>
       </w:r>
     </w:p>
     <w:p>
@@ -1998,7 +2436,72 @@
       </w:pPr>
       <w:r>
         <w:rPr/>
-        <w:t xml:space="preserve">Далее в документе микроконтроллер esp32s3 обозначается как МК1, а микроконтроллер ch32v203 как МК2. Микросхема pcm5102a — как ЦАП, Микросхема pcm1804 — как АЦП. Tft lcd дисплей как дисплей. </w:t>
+        <w:t xml:space="preserve">Дисплей. Может быть использован TFT LCD дисплей из следующего ряда (ili9341 (320*240), ili9486 (480*320)). Дисплей подключается к </w:t>
+      </w:r>
+      <w:r>
+        <w:rPr/>
+        <w:t>МК1</w:t>
+      </w:r>
+      <w:r>
+        <w:rPr/>
+        <w:t xml:space="preserve"> посредством параллельной 8 битной шины i8080. Питание дисплея 5 В и 3.3 В </w:t>
+      </w:r>
+      <w:r>
+        <w:rPr/>
+        <w:t>для питания сигнальной шины</w:t>
+      </w:r>
+      <w:r>
+        <w:rPr/>
+        <w:t>.</w:t>
+      </w:r>
+    </w:p>
+    <w:p>
+      <w:pPr>
+        <w:pStyle w:val="11111"/>
+        <w:ind w:firstLine="709"/>
+        <w:rPr/>
+      </w:pPr>
+      <w:r>
+        <w:rPr/>
+        <w:t xml:space="preserve">Подчиненный микроконтроллер (сh32v203) </w:t>
+      </w:r>
+      <w:r>
+        <w:rPr/>
+        <w:t>(далее МК2)</w:t>
+      </w:r>
+      <w:r>
+        <w:rPr/>
+        <w:t xml:space="preserve"> обеспечивает опрос кнопок и энкодеров. </w:t>
+      </w:r>
+      <w:r>
+        <w:rPr/>
+        <w:t>Использование подчиненного микроконтроллера позволяет разгрузить МК1 лишней обработки и при необходимости дополнительно расширить порты ввода/вывода. МК2 с</w:t>
+      </w:r>
+      <w:r>
+        <w:rPr/>
+        <w:t xml:space="preserve">оединяется с </w:t>
+      </w:r>
+      <w:r>
+        <w:rPr/>
+        <w:t>МК1</w:t>
+      </w:r>
+      <w:r>
+        <w:rPr/>
+        <w:t xml:space="preserve"> посредством интерфейса UART. </w:t>
+      </w:r>
+      <w:r>
+        <w:rPr/>
+        <w:t>Протокол обмена приведен в пункте 7.</w:t>
+      </w:r>
+    </w:p>
+    <w:p>
+      <w:pPr>
+        <w:pStyle w:val="11111"/>
+        <w:ind w:firstLine="709"/>
+        <w:rPr/>
+      </w:pPr>
+      <w:r>
+        <w:rPr/>
       </w:r>
     </w:p>
     <w:p>
@@ -2006,6 +2509,8 @@
         <w:pStyle w:val="Heading1"/>
         <w:rPr/>
       </w:pPr>
+      <w:bookmarkStart w:id="8" w:name="__RefHeading___Toc311_3911609550"/>
+      <w:bookmarkEnd w:id="8"/>
       <w:r>
         <w:rPr>
           <w:shd w:fill="FFFFFF" w:val="clear"/>
@@ -2028,391 +2533,25 @@
         <w:pStyle w:val="Heading2"/>
         <w:rPr/>
       </w:pPr>
-      <w:r>
-        <w:rPr/>
-        <w:t>Определение</w:t>
-      </w:r>
-    </w:p>
-    <w:p>
-      <w:pPr>
-        <w:pStyle w:val="Heading1"/>
-        <w:rPr>
-          <w:shd w:fill="FFFFFF" w:val="clear"/>
-        </w:rPr>
-      </w:pPr>
-      <w:r>
-        <w:rPr>
-          <w:shd w:fill="FFFFFF" w:val="clear"/>
-        </w:rPr>
-        <w:t>Описание электрической схемы</w:t>
+      <w:bookmarkStart w:id="9" w:name="__RefHeading___Toc313_3911609550"/>
+      <w:bookmarkEnd w:id="9"/>
+      <w:r>
+        <w:rPr/>
+        <w:t xml:space="preserve">Определение </w:t>
+      </w:r>
+      <w:r>
+        <w:rPr/>
+        <w:t xml:space="preserve">параметров ФНЧ фильтров. </w:t>
       </w:r>
     </w:p>
     <w:p>
       <w:pPr>
         <w:pStyle w:val="Heading2"/>
-        <w:rPr>
-          <w:shd w:fill="FFFFFF" w:val="clear"/>
-        </w:rPr>
-      </w:pPr>
-      <w:r>
-        <w:rPr>
-          <w:shd w:fill="FFFFFF" w:val="clear"/>
-        </w:rPr>
-        <w:t xml:space="preserve">Электрическая принципиальная приведена в электронном документе (1220200037474.468173.000 Э3 с перечнем элементов). </w:t>
-      </w:r>
-    </w:p>
-    <w:p>
-      <w:pPr>
-        <w:pStyle w:val="Heading2"/>
-        <w:rPr>
-          <w:shd w:fill="FFFFFF" w:val="clear"/>
-        </w:rPr>
-      </w:pPr>
-      <w:r>
-        <w:rPr>
-          <w:shd w:fill="FFFFFF" w:val="clear"/>
-        </w:rPr>
-      </w:r>
-    </w:p>
-    <w:p>
-      <w:pPr>
-        <w:pStyle w:val="Heading1"/>
-        <w:rPr>
-          <w:shd w:fill="FFFFFF" w:val="clear"/>
-        </w:rPr>
-      </w:pPr>
-      <w:r>
-        <w:rPr>
-          <w:shd w:fill="FFFFFF" w:val="clear"/>
-        </w:rPr>
-        <w:t xml:space="preserve">Конструкторский </w:t>
-      </w:r>
-      <w:r>
-        <w:rPr/>
-        <w:t>раздел</w:t>
-      </w:r>
-    </w:p>
-    <w:p>
-      <w:pPr>
-        <w:pStyle w:val="Heading2"/>
-        <w:rPr>
-          <w:shd w:fill="FFFFFF" w:val="clear"/>
-        </w:rPr>
-      </w:pPr>
-      <w:r>
-        <w:rPr>
-          <w:shd w:fill="FFFFFF" w:val="clear"/>
-        </w:rPr>
-        <w:t xml:space="preserve">Конструкция устройства создана по подобию шилдов. </w:t>
-      </w:r>
-      <w:r>
-        <w:rPr>
-          <w:shd w:fill="FFFFFF" w:val="clear"/>
-        </w:rPr>
-        <w:t>В несущую плату содержащую МК1 и МК2 вставляется шилд дисплея.</w:t>
-      </w:r>
-    </w:p>
-    <w:p>
-      <w:pPr>
-        <w:pStyle w:val="Heading2"/>
-        <w:rPr>
-          <w:shd w:fill="FFFFFF" w:val="clear"/>
-        </w:rPr>
-      </w:pPr>
-      <w:r>
-        <w:rPr>
-          <w:shd w:fill="FFFFFF" w:val="clear"/>
-        </w:rPr>
-        <w:t>Корпус печатается на 3D принтере.</w:t>
-      </w:r>
-      <w:r>
-        <w:rPr>
-          <w:shd w:fill="FFFFFF" w:val="clear"/>
-        </w:rPr>
-        <w:t xml:space="preserve"> </w:t>
-      </w:r>
-    </w:p>
-    <w:p>
-      <w:pPr>
-        <w:pStyle w:val="Heading2"/>
-        <w:rPr>
-          <w:shd w:fill="FFFFFF" w:val="clear"/>
-        </w:rPr>
-      </w:pPr>
-      <w:r>
-        <w:rPr>
-          <w:shd w:fill="FFFFFF" w:val="clear"/>
-        </w:rPr>
-        <w:t>Печатная плата двухслойная с толщиной меди 0,35 мкм.</w:t>
-      </w:r>
-    </w:p>
-    <w:p>
-      <w:pPr>
-        <w:pStyle w:val="Heading1"/>
-        <w:rPr>
-          <w:shd w:fill="FFFFFF" w:val="clear"/>
-        </w:rPr>
-      </w:pPr>
-      <w:r>
-        <w:rPr>
-          <w:shd w:fill="FFFFFF" w:val="clear"/>
-        </w:rPr>
-        <w:t>Алгоритм работы</w:t>
-      </w:r>
-    </w:p>
-    <w:p>
-      <w:pPr>
-        <w:pStyle w:val="Heading2"/>
-        <w:rPr>
-          <w:shd w:fill="FFFFFF" w:val="clear"/>
-        </w:rPr>
-      </w:pPr>
-      <w:r>
-        <w:rPr>
-          <w:shd w:fill="FFFFFF" w:val="clear"/>
-        </w:rPr>
-        <w:t>В данном разделе приведено описание алгоритма работы устройства.</w:t>
-      </w:r>
-    </w:p>
-    <w:p>
-      <w:pPr>
-        <w:pStyle w:val="Heading2"/>
-        <w:rPr>
-          <w:shd w:fill="FFFFFF" w:val="clear"/>
-        </w:rPr>
-      </w:pPr>
-      <w:r>
-        <w:rPr>
-          <w:shd w:fill="FFFFFF" w:val="clear"/>
-        </w:rPr>
-        <w:t>После подачи питания на схему начинается работа загрузчика (стандартный bootloader esp-idf). Загрузчик инициализирует контроллер памяти, вектора прерываний. После передает управление основной прошивке пользователя.</w:t>
-      </w:r>
-    </w:p>
-    <w:p>
-      <w:pPr>
-        <w:pStyle w:val="Heading2"/>
-        <w:rPr>
-          <w:shd w:fill="FFFFFF" w:val="clear"/>
-        </w:rPr>
-      </w:pPr>
-      <w:r>
-        <w:rPr>
-          <w:shd w:fill="FFFFFF" w:val="clear"/>
-        </w:rPr>
-      </w:r>
-    </w:p>
-    <w:p>
-      <w:pPr>
-        <w:pStyle w:val="Heading2"/>
-        <w:rPr>
-          <w:shd w:fill="FFFFFF" w:val="clear"/>
-        </w:rPr>
-      </w:pPr>
-      <w:r>
-        <w:rPr>
-          <w:shd w:fill="FFFFFF" w:val="clear"/>
-        </w:rPr>
-        <w:t xml:space="preserve">В основной прошивке МК1 последовательно инициализируется работа с МК2 (ch32v203). Подчиненный контроллер переводится в режим загрузки из системной памяти (путем подтяжки входа boot0 к 3,3В). </w:t>
-      </w:r>
-    </w:p>
-    <w:p>
-      <w:pPr>
-        <w:pStyle w:val="Heading2"/>
-        <w:rPr>
-          <w:shd w:fill="FFFFFF" w:val="clear"/>
-        </w:rPr>
-      </w:pPr>
-      <w:r>
-        <w:rPr>
-          <w:shd w:fill="FFFFFF" w:val="clear"/>
-        </w:rPr>
-        <w:t xml:space="preserve">Происходит инициализация дисплея. Дисплей работает под управлением бибилиотеки esp-lcd. Интерфейс отрисовывается при помощи графической бибилиотеки esp-lvgl. </w:t>
-      </w:r>
-    </w:p>
-    <w:p>
-      <w:pPr>
-        <w:pStyle w:val="Heading2"/>
-        <w:rPr>
-          <w:shd w:fill="FFFFFF" w:val="clear"/>
-        </w:rPr>
-      </w:pPr>
-      <w:r>
-        <w:rPr>
-          <w:shd w:fill="FFFFFF" w:val="clear"/>
-        </w:rPr>
-        <w:t>Который позволяет с помощью команд wchisp писать, стирать, считывать флэш память. Считывается прошивк</w:t>
-      </w:r>
-      <w:r>
-        <w:rPr>
-          <w:shd w:fill="FFFFFF" w:val="clear"/>
-        </w:rPr>
-        <w:t>f МК2</w:t>
-      </w:r>
-      <w:r>
-        <w:rPr>
-          <w:shd w:fill="FFFFFF" w:val="clear"/>
-        </w:rPr>
-        <w:t>. Если прошивка в МК</w:t>
-      </w:r>
-      <w:r>
-        <w:rPr>
-          <w:shd w:fill="FFFFFF" w:val="clear"/>
-        </w:rPr>
-        <w:t>2</w:t>
-      </w:r>
-      <w:r>
-        <w:rPr>
-          <w:shd w:fill="FFFFFF" w:val="clear"/>
-        </w:rPr>
-        <w:t xml:space="preserve"> соответствует версии прошивки МК</w:t>
-      </w:r>
-      <w:r>
-        <w:rPr>
-          <w:shd w:fill="FFFFFF" w:val="clear"/>
-        </w:rPr>
-        <w:t xml:space="preserve">2 </w:t>
-      </w:r>
-      <w:r>
-        <w:rPr>
-          <w:shd w:fill="FFFFFF" w:val="clear"/>
-        </w:rPr>
-        <w:t>лежащей внутри прошивки МК1, происходит перезагрузка МК2 без перепрошивки. Иначе происходит перепрошивка МК2 и также его перезагрузка.</w:t>
-      </w:r>
-    </w:p>
-    <w:p>
-      <w:pPr>
-        <w:pStyle w:val="Heading2"/>
-        <w:rPr>
-          <w:shd w:fill="FFFFFF" w:val="clear"/>
-        </w:rPr>
-      </w:pPr>
-      <w:r>
-        <w:rPr>
-          <w:shd w:fill="FFFFFF" w:val="clear"/>
-        </w:rPr>
-        <w:t>После запуска МК</w:t>
-      </w:r>
-      <w:r>
-        <w:rPr>
-          <w:shd w:fill="FFFFFF" w:val="clear"/>
-        </w:rPr>
-        <w:t>2 в цикле опрашивает энкодеры и кнопки. Если состояние энкодера или кнопки изменилось данные изменения передаются по UART в МК1.</w:t>
-      </w:r>
-    </w:p>
-    <w:p>
-      <w:pPr>
-        <w:pStyle w:val="Heading2"/>
-        <w:rPr>
-          <w:shd w:fill="FFFFFF" w:val="clear"/>
-        </w:rPr>
-      </w:pPr>
-      <w:r>
-        <w:rPr>
-          <w:shd w:fill="FFFFFF" w:val="clear"/>
-        </w:rPr>
-        <w:t>В МК</w:t>
-      </w:r>
-      <w:r>
-        <w:rPr>
-          <w:shd w:fill="FFFFFF" w:val="clear"/>
-        </w:rPr>
-        <w:t>1 запускаются следующие задачи:</w:t>
-      </w:r>
-    </w:p>
-    <w:p>
-      <w:pPr>
-        <w:pStyle w:val="Heading2"/>
-        <w:numPr>
-          <w:ilvl w:val="1"/>
-          <w:numId w:val="6"/>
-        </w:numPr>
-        <w:rPr>
-          <w:shd w:fill="FFFFFF" w:val="clear"/>
-        </w:rPr>
-      </w:pPr>
-      <w:r>
-        <w:rPr>
-          <w:shd w:fill="FFFFFF" w:val="clear"/>
-        </w:rPr>
-        <w:t>u</w:t>
-      </w:r>
-      <w:r>
-        <w:rPr>
-          <w:shd w:fill="FFFFFF" w:val="clear"/>
-        </w:rPr>
-        <w:t>art_handler — считывать по uart от МК2 состояние кнопок и энкодеров;</w:t>
-      </w:r>
-    </w:p>
-    <w:p>
-      <w:pPr>
-        <w:pStyle w:val="Heading2"/>
-        <w:numPr>
-          <w:ilvl w:val="1"/>
-          <w:numId w:val="6"/>
-        </w:numPr>
-        <w:rPr>
-          <w:shd w:fill="FFFFFF" w:val="clear"/>
-        </w:rPr>
-      </w:pPr>
-      <w:r>
-        <w:rPr>
-          <w:shd w:fill="FFFFFF" w:val="clear"/>
-        </w:rPr>
-        <w:t>lvgl_update — обновляет экран и состояние кнопок;</w:t>
-      </w:r>
-    </w:p>
-    <w:p>
-      <w:pPr>
-        <w:pStyle w:val="Heading2"/>
-        <w:numPr>
-          <w:ilvl w:val="1"/>
-          <w:numId w:val="6"/>
-        </w:numPr>
-        <w:rPr>
-          <w:shd w:fill="FFFFFF" w:val="clear"/>
-        </w:rPr>
-      </w:pPr>
-      <w:r>
-        <w:rPr>
-          <w:shd w:fill="FFFFFF" w:val="clear"/>
-        </w:rPr>
-        <w:t>adc_handler  - опрос и получение данных из АЦП;</w:t>
-      </w:r>
-    </w:p>
-    <w:p>
-      <w:pPr>
-        <w:pStyle w:val="Heading2"/>
-        <w:numPr>
-          <w:ilvl w:val="1"/>
-          <w:numId w:val="6"/>
-        </w:numPr>
-        <w:rPr>
-          <w:shd w:fill="FFFFFF" w:val="clear"/>
-        </w:rPr>
-      </w:pPr>
-      <w:r>
-        <w:rPr>
-          <w:shd w:fill="FFFFFF" w:val="clear"/>
-        </w:rPr>
-        <w:t>dac_handler — обновление и отправка данных для ЦАП;</w:t>
-      </w:r>
-    </w:p>
-    <w:p>
-      <w:pPr>
-        <w:pStyle w:val="Heading2"/>
-        <w:numPr>
-          <w:ilvl w:val="1"/>
-          <w:numId w:val="6"/>
-        </w:numPr>
-        <w:rPr>
-          <w:shd w:fill="FFFFFF" w:val="clear"/>
-        </w:rPr>
-      </w:pPr>
-      <w:r>
-        <w:rPr>
-          <w:shd w:fill="FFFFFF" w:val="clear"/>
-        </w:rPr>
-        <w:t>app_cycle — обработка в цикле состояния задач и обновление их статуса, обновление буферов, запуск fft.</w:t>
+        <w:rPr/>
+      </w:pPr>
+      <w:r>
+        <w:rPr/>
+        <w:t>Фильтр на выходе ЦАП.</w:t>
       </w:r>
     </w:p>
     <w:p>
@@ -2423,6 +2562,524 @@
           <w:numId w:val="0"/>
         </w:numPr>
         <w:ind w:hanging="0" w:start="576"/>
+        <w:rPr/>
+      </w:pPr>
+      <w:r>
+        <w:rPr/>
+        <w:t xml:space="preserve">Максимальная частота </w:t>
+      </w:r>
+    </w:p>
+    <w:p>
+      <w:pPr>
+        <w:pStyle w:val="Heading2"/>
+        <w:rPr/>
+      </w:pPr>
+      <w:r>
+        <w:rPr/>
+        <w:t>Фильтр на входе АЦП.</w:t>
+      </w:r>
+    </w:p>
+    <w:p>
+      <w:pPr>
+        <w:pStyle w:val="Heading2"/>
+        <w:numPr>
+          <w:ilvl w:val="0"/>
+          <w:numId w:val="0"/>
+        </w:numPr>
+        <w:ind w:hanging="0" w:start="576"/>
+        <w:rPr/>
+      </w:pPr>
+      <w:r>
+        <w:rPr/>
+      </w:r>
+    </w:p>
+    <w:p>
+      <w:pPr>
+        <w:pStyle w:val="Heading1"/>
+        <w:rPr>
+          <w:shd w:fill="FFFFFF" w:val="clear"/>
+        </w:rPr>
+      </w:pPr>
+      <w:bookmarkStart w:id="10" w:name="__RefHeading___Toc315_3911609550"/>
+      <w:bookmarkEnd w:id="10"/>
+      <w:r>
+        <w:rPr>
+          <w:shd w:fill="FFFFFF" w:val="clear"/>
+        </w:rPr>
+        <w:t>Описание электрической схемы</w:t>
+      </w:r>
+    </w:p>
+    <w:p>
+      <w:pPr>
+        <w:pStyle w:val="Heading2"/>
+        <w:rPr>
+          <w:shd w:fill="FFFFFF" w:val="clear"/>
+        </w:rPr>
+      </w:pPr>
+      <w:bookmarkStart w:id="11" w:name="__RefHeading___Toc317_3911609550"/>
+      <w:bookmarkEnd w:id="11"/>
+      <w:r>
+        <w:rPr>
+          <w:shd w:fill="FFFFFF" w:val="clear"/>
+        </w:rPr>
+        <w:t xml:space="preserve">Электрическая принципиальная приведена в электронном документе (1220200037474.468173.000 Э3 с перечнем элементов). </w:t>
+      </w:r>
+    </w:p>
+    <w:p>
+      <w:pPr>
+        <w:pStyle w:val="Heading2"/>
+        <w:rPr>
+          <w:shd w:fill="FFFFFF" w:val="clear"/>
+        </w:rPr>
+      </w:pPr>
+      <w:r>
+        <w:rPr>
+          <w:shd w:fill="FFFFFF" w:val="clear"/>
+        </w:rPr>
+      </w:r>
+    </w:p>
+    <w:p>
+      <w:pPr>
+        <w:pStyle w:val="Heading1"/>
+        <w:rPr>
+          <w:shd w:fill="FFFFFF" w:val="clear"/>
+        </w:rPr>
+      </w:pPr>
+      <w:bookmarkStart w:id="12" w:name="__RefHeading___Toc319_3911609550"/>
+      <w:bookmarkEnd w:id="12"/>
+      <w:r>
+        <w:rPr>
+          <w:shd w:fill="FFFFFF" w:val="clear"/>
+        </w:rPr>
+        <w:t xml:space="preserve">Конструкторский </w:t>
+      </w:r>
+      <w:r>
+        <w:rPr/>
+        <w:t>раздел</w:t>
+      </w:r>
+    </w:p>
+    <w:p>
+      <w:pPr>
+        <w:pStyle w:val="Heading2"/>
+        <w:rPr>
+          <w:shd w:fill="FFFFFF" w:val="clear"/>
+        </w:rPr>
+      </w:pPr>
+      <w:bookmarkStart w:id="13" w:name="__RefHeading___Toc321_3911609550"/>
+      <w:bookmarkEnd w:id="13"/>
+      <w:r>
+        <w:rPr>
+          <w:shd w:fill="FFFFFF" w:val="clear"/>
+        </w:rPr>
+        <w:t>Конструкция устройства создана по подобию шилдов. В несущую плату содержащую МК1 и МК2 вставляется шилд дисплея.</w:t>
+      </w:r>
+    </w:p>
+    <w:p>
+      <w:pPr>
+        <w:pStyle w:val="Heading2"/>
+        <w:rPr>
+          <w:shd w:fill="FFFFFF" w:val="clear"/>
+        </w:rPr>
+      </w:pPr>
+      <w:bookmarkStart w:id="14" w:name="__RefHeading___Toc323_3911609550"/>
+      <w:bookmarkEnd w:id="14"/>
+      <w:r>
+        <w:rPr>
+          <w:shd w:fill="FFFFFF" w:val="clear"/>
+        </w:rPr>
+        <w:t xml:space="preserve">Корпус печатается на 3D принтере. </w:t>
+      </w:r>
+    </w:p>
+    <w:p>
+      <w:pPr>
+        <w:pStyle w:val="Heading2"/>
+        <w:rPr>
+          <w:shd w:fill="FFFFFF" w:val="clear"/>
+        </w:rPr>
+      </w:pPr>
+      <w:bookmarkStart w:id="15" w:name="__RefHeading___Toc325_3911609550"/>
+      <w:bookmarkEnd w:id="15"/>
+      <w:r>
+        <w:rPr>
+          <w:shd w:fill="FFFFFF" w:val="clear"/>
+        </w:rPr>
+        <w:t>Печатная плата двухслойная с толщиной меди 0,35 мкм.</w:t>
+      </w:r>
+    </w:p>
+    <w:p>
+      <w:pPr>
+        <w:pStyle w:val="Heading1"/>
+        <w:rPr>
+          <w:shd w:fill="FFFFFF" w:val="clear"/>
+        </w:rPr>
+      </w:pPr>
+      <w:bookmarkStart w:id="16" w:name="__RefHeading___Toc327_3911609550"/>
+      <w:bookmarkEnd w:id="16"/>
+      <w:r>
+        <w:rPr>
+          <w:shd w:fill="FFFFFF" w:val="clear"/>
+        </w:rPr>
+        <w:t>Организация исходных кодов ПО</w:t>
+      </w:r>
+    </w:p>
+    <w:p>
+      <w:pPr>
+        <w:pStyle w:val="Heading1"/>
+        <w:rPr>
+          <w:shd w:fill="FFFFFF" w:val="clear"/>
+        </w:rPr>
+      </w:pPr>
+      <w:bookmarkStart w:id="17" w:name="__RefHeading___Toc327_3911609550_Копия_1"/>
+      <w:bookmarkEnd w:id="17"/>
+      <w:r>
+        <w:rPr>
+          <w:shd w:fill="FFFFFF" w:val="clear"/>
+        </w:rPr>
+        <w:t>Алгоритм работы</w:t>
+      </w:r>
+    </w:p>
+    <w:p>
+      <w:pPr>
+        <w:pStyle w:val="Heading2"/>
+        <w:rPr>
+          <w:shd w:fill="FFFFFF" w:val="clear"/>
+        </w:rPr>
+      </w:pPr>
+      <w:bookmarkStart w:id="18" w:name="__RefHeading___Toc329_3911609550"/>
+      <w:bookmarkEnd w:id="18"/>
+      <w:r>
+        <w:rPr>
+          <w:shd w:fill="FFFFFF" w:val="clear"/>
+        </w:rPr>
+        <w:t>В данном разделе приведено описание алгоритма работы устройства.</w:t>
+      </w:r>
+    </w:p>
+    <w:p>
+      <w:pPr>
+        <w:pStyle w:val="Heading2"/>
+        <w:rPr>
+          <w:shd w:fill="FFFFFF" w:val="clear"/>
+        </w:rPr>
+      </w:pPr>
+      <w:bookmarkStart w:id="19" w:name="__RefHeading___Toc331_3911609550"/>
+      <w:bookmarkEnd w:id="19"/>
+      <w:r>
+        <w:rPr>
+          <w:shd w:fill="FFFFFF" w:val="clear"/>
+        </w:rPr>
+        <w:t>После подачи питания на схему начинается работа загрузчика (стандартный bootloader esp-idf). Загрузчик инициализирует контроллер памяти, вектора прерываний. После передает управление основной прошивке пользователя.</w:t>
+      </w:r>
+    </w:p>
+    <w:p>
+      <w:pPr>
+        <w:pStyle w:val="Heading2"/>
+        <w:rPr>
+          <w:shd w:fill="FFFFFF" w:val="clear"/>
+        </w:rPr>
+      </w:pPr>
+      <w:bookmarkStart w:id="20" w:name="__RefHeading___Toc333_3911609550"/>
+      <w:bookmarkEnd w:id="20"/>
+      <w:r>
+        <w:rPr>
+          <w:shd w:fill="FFFFFF" w:val="clear"/>
+        </w:rPr>
+        <w:t xml:space="preserve">В основной прошивке МК1 последовательно инициализируется работа с МК2 (ch32v203). Подчиненный контроллер переводится в режим загрузки из системной памяти (путем подтяжки входа boot0 к 3,3В). </w:t>
+      </w:r>
+    </w:p>
+    <w:p>
+      <w:pPr>
+        <w:pStyle w:val="Heading2"/>
+        <w:rPr>
+          <w:shd w:fill="FFFFFF" w:val="clear"/>
+        </w:rPr>
+      </w:pPr>
+      <w:bookmarkStart w:id="21" w:name="__RefHeading___Toc335_3911609550"/>
+      <w:bookmarkEnd w:id="21"/>
+      <w:r>
+        <w:rPr>
+          <w:shd w:fill="FFFFFF" w:val="clear"/>
+        </w:rPr>
+        <w:t xml:space="preserve">Происходит инициализация дисплея. Дисплей работает под управлением бибилиотеки esp-lcd. Интерфейс отрисовывается при помощи графической бибилиотеки esp-lvgl. </w:t>
+      </w:r>
+      <w:r>
+        <w:rPr>
+          <w:shd w:fill="FFFFFF" w:val="clear"/>
+        </w:rPr>
+        <w:t>На дисплей выводится приветственная надпись.</w:t>
+      </w:r>
+    </w:p>
+    <w:p>
+      <w:pPr>
+        <w:pStyle w:val="Heading2"/>
+        <w:rPr>
+          <w:shd w:fill="FFFFFF" w:val="clear"/>
+        </w:rPr>
+      </w:pPr>
+      <w:bookmarkStart w:id="22" w:name="__RefHeading___Toc337_3911609550"/>
+      <w:bookmarkEnd w:id="22"/>
+      <w:r>
+        <w:rPr>
+          <w:shd w:fill="FFFFFF" w:val="clear"/>
+        </w:rPr>
+        <w:t>Затем</w:t>
+      </w:r>
+      <w:r>
+        <w:rPr>
+          <w:shd w:fill="FFFFFF" w:val="clear"/>
+        </w:rPr>
+        <w:t xml:space="preserve"> с помощью команд wchisp </w:t>
+      </w:r>
+      <w:r>
+        <w:rPr>
+          <w:shd w:fill="FFFFFF" w:val="clear"/>
+        </w:rPr>
+        <w:t>(системный загрзучик)</w:t>
+      </w:r>
+      <w:r>
+        <w:rPr>
+          <w:shd w:fill="FFFFFF" w:val="clear"/>
+        </w:rPr>
+        <w:t xml:space="preserve"> </w:t>
+      </w:r>
+      <w:r>
+        <w:rPr>
+          <w:shd w:fill="FFFFFF" w:val="clear"/>
+        </w:rPr>
+        <w:t>производится верификация</w:t>
+      </w:r>
+      <w:r>
+        <w:rPr>
+          <w:shd w:fill="FFFFFF" w:val="clear"/>
+        </w:rPr>
+        <w:t xml:space="preserve"> прошивк</w:t>
+      </w:r>
+      <w:r>
+        <w:rPr>
+          <w:shd w:fill="FFFFFF" w:val="clear"/>
+        </w:rPr>
+        <w:t>и</w:t>
+      </w:r>
+      <w:r>
+        <w:rPr>
+          <w:shd w:fill="FFFFFF" w:val="clear"/>
+        </w:rPr>
+        <w:t xml:space="preserve"> МК2. Если прошивка в МК2 соответствует версии прошивки МК2 лежащей внутри прошивки МК1, происходит перезагрузка МК2 без перепрошивки. Иначе происходит перепрошивка МК2 и также его перезагрузка.</w:t>
+      </w:r>
+    </w:p>
+    <w:p>
+      <w:pPr>
+        <w:pStyle w:val="Heading2"/>
+        <w:rPr>
+          <w:shd w:fill="FFFFFF" w:val="clear"/>
+        </w:rPr>
+      </w:pPr>
+      <w:bookmarkStart w:id="23" w:name="__RefHeading___Toc339_3911609550"/>
+      <w:bookmarkEnd w:id="23"/>
+      <w:r>
+        <w:rPr>
+          <w:shd w:fill="FFFFFF" w:val="clear"/>
+        </w:rPr>
+        <w:t>После запуска МК2 в цикле опрашивает энкодеры и кнопки. Если состояние энкодера или кноп</w:t>
+      </w:r>
+      <w:r>
+        <w:rPr>
+          <w:shd w:fill="FFFFFF" w:val="clear"/>
+        </w:rPr>
+        <w:t>ок</w:t>
+      </w:r>
+      <w:r>
+        <w:rPr>
+          <w:shd w:fill="FFFFFF" w:val="clear"/>
+        </w:rPr>
+        <w:t xml:space="preserve"> изменилось данные изменения передаются по UART в МК1. </w:t>
+      </w:r>
+      <w:r>
+        <w:rPr>
+          <w:shd w:fill="FFFFFF" w:val="clear"/>
+        </w:rPr>
+        <w:t>Протокол обмена МК2 с МК1:</w:t>
+      </w:r>
+    </w:p>
+    <w:p>
+      <w:pPr>
+        <w:pStyle w:val="Heading2"/>
+        <w:numPr>
+          <w:ilvl w:val="0"/>
+          <w:numId w:val="0"/>
+        </w:numPr>
+        <w:ind w:hanging="0" w:start="576"/>
+        <w:rPr>
+          <w:shd w:fill="FFFFFF" w:val="clear"/>
+        </w:rPr>
+      </w:pPr>
+      <w:r>
+        <w:rPr>
+          <w:shd w:fill="FFFFFF" w:val="clear"/>
+        </w:rPr>
+      </w:r>
+    </w:p>
+    <w:p>
+      <w:pPr>
+        <w:pStyle w:val="Heading2"/>
+        <w:rPr>
+          <w:shd w:fill="FFFFFF" w:val="clear"/>
+        </w:rPr>
+      </w:pPr>
+      <w:r>
+        <w:rPr>
+          <w:shd w:fill="FFFFFF" w:val="clear"/>
+        </w:rPr>
+        <w:t xml:space="preserve">Затем инициализируются интерфейсы I2S для работы с АЦП и ЦАП. </w:t>
+      </w:r>
+    </w:p>
+    <w:p>
+      <w:pPr>
+        <w:pStyle w:val="Heading2"/>
+        <w:rPr>
+          <w:shd w:fill="FFFFFF" w:val="clear"/>
+        </w:rPr>
+      </w:pPr>
+      <w:r>
+        <w:rPr>
+          <w:shd w:fill="FFFFFF" w:val="clear"/>
+        </w:rPr>
+        <w:t>Далее МК1 производит опрос МК2, отрисовку дисплея, обновление буферов для ЦАП, и заполнение буферов от АЦП.</w:t>
+      </w:r>
+    </w:p>
+    <w:p>
+      <w:pPr>
+        <w:pStyle w:val="Heading2"/>
+        <w:rPr>
+          <w:shd w:fill="FFFFFF" w:val="clear"/>
+        </w:rPr>
+      </w:pPr>
+      <w:r>
+        <w:rPr>
+          <w:shd w:fill="FFFFFF" w:val="clear"/>
+        </w:rPr>
+        <w:t xml:space="preserve">В МК1 </w:t>
+      </w:r>
+      <w:r>
+        <w:rPr>
+          <w:shd w:fill="FFFFFF" w:val="clear"/>
+        </w:rPr>
+        <w:t>работает под управлением freertos для esp. В программе работают и</w:t>
+      </w:r>
+      <w:r>
+        <w:rPr>
+          <w:shd w:fill="FFFFFF" w:val="clear"/>
+        </w:rPr>
+        <w:t xml:space="preserve"> запускаются следующие задачи:</w:t>
+      </w:r>
+    </w:p>
+    <w:p>
+      <w:pPr>
+        <w:pStyle w:val="Heading2"/>
+        <w:numPr>
+          <w:ilvl w:val="1"/>
+          <w:numId w:val="6"/>
+        </w:numPr>
+        <w:rPr>
+          <w:shd w:fill="FFFFFF" w:val="clear"/>
+        </w:rPr>
+      </w:pPr>
+      <w:bookmarkStart w:id="24" w:name="__RefHeading___Toc343_3911609550"/>
+      <w:bookmarkEnd w:id="24"/>
+      <w:r>
+        <w:rPr>
+          <w:shd w:fill="FFFFFF" w:val="clear"/>
+        </w:rPr>
+        <w:t>uart_handler — считывать по uart от МК2 состояние кнопок и энкодеров;</w:t>
+      </w:r>
+    </w:p>
+    <w:p>
+      <w:pPr>
+        <w:pStyle w:val="Heading2"/>
+        <w:numPr>
+          <w:ilvl w:val="1"/>
+          <w:numId w:val="6"/>
+        </w:numPr>
+        <w:rPr>
+          <w:shd w:fill="FFFFFF" w:val="clear"/>
+        </w:rPr>
+      </w:pPr>
+      <w:bookmarkStart w:id="25" w:name="__RefHeading___Toc345_3911609550"/>
+      <w:bookmarkEnd w:id="25"/>
+      <w:r>
+        <w:rPr>
+          <w:shd w:fill="FFFFFF" w:val="clear"/>
+        </w:rPr>
+        <w:t>lvgl_update — обновляет экран и состояние кнопок;</w:t>
+      </w:r>
+    </w:p>
+    <w:p>
+      <w:pPr>
+        <w:pStyle w:val="Heading2"/>
+        <w:numPr>
+          <w:ilvl w:val="1"/>
+          <w:numId w:val="6"/>
+        </w:numPr>
+        <w:rPr>
+          <w:shd w:fill="FFFFFF" w:val="clear"/>
+        </w:rPr>
+      </w:pPr>
+      <w:bookmarkStart w:id="26" w:name="__RefHeading___Toc347_3911609550"/>
+      <w:bookmarkEnd w:id="26"/>
+      <w:r>
+        <w:rPr>
+          <w:shd w:fill="FFFFFF" w:val="clear"/>
+        </w:rPr>
+        <w:t>adc_handler  - опрос и получение данных из АЦП;</w:t>
+      </w:r>
+    </w:p>
+    <w:p>
+      <w:pPr>
+        <w:pStyle w:val="Heading2"/>
+        <w:numPr>
+          <w:ilvl w:val="1"/>
+          <w:numId w:val="6"/>
+        </w:numPr>
+        <w:rPr>
+          <w:shd w:fill="FFFFFF" w:val="clear"/>
+        </w:rPr>
+      </w:pPr>
+      <w:bookmarkStart w:id="27" w:name="__RefHeading___Toc349_3911609550"/>
+      <w:bookmarkEnd w:id="27"/>
+      <w:r>
+        <w:rPr>
+          <w:shd w:fill="FFFFFF" w:val="clear"/>
+        </w:rPr>
+        <w:t>dac_handler — обновление и отправка данных для ЦАП;</w:t>
+      </w:r>
+    </w:p>
+    <w:p>
+      <w:pPr>
+        <w:pStyle w:val="Heading2"/>
+        <w:numPr>
+          <w:ilvl w:val="1"/>
+          <w:numId w:val="6"/>
+        </w:numPr>
+        <w:rPr>
+          <w:shd w:fill="FFFFFF" w:val="clear"/>
+        </w:rPr>
+      </w:pPr>
+      <w:bookmarkStart w:id="28" w:name="__RefHeading___Toc351_3911609550"/>
+      <w:bookmarkEnd w:id="28"/>
+      <w:r>
+        <w:rPr>
+          <w:shd w:fill="FFFFFF" w:val="clear"/>
+        </w:rPr>
+        <w:t>app_cycle — обработка в цикле состояния задач и обновление их статуса, обновление буферов, запуск fft.</w:t>
+      </w:r>
+    </w:p>
+    <w:p>
+      <w:pPr>
+        <w:pStyle w:val="Heading2"/>
+        <w:numPr>
+          <w:ilvl w:val="0"/>
+          <w:numId w:val="0"/>
+        </w:numPr>
+        <w:ind w:hanging="0" w:start="576"/>
         <w:rPr>
           <w:shd w:fill="FFFFFF" w:val="clear"/>
         </w:rPr>
@@ -2441,6 +3098,8 @@
           <w:lang w:eastAsia="ru-RU"/>
         </w:rPr>
       </w:pPr>
+      <w:bookmarkStart w:id="29" w:name="__RefHeading___Toc353_3911609550"/>
+      <w:bookmarkEnd w:id="29"/>
       <w:r>
         <w:rPr>
           <w:rFonts w:eastAsia="Times New Roman"/>
@@ -2464,6 +3123,7 @@
           <w:bCs w:val="false"/>
           <w:lang w:eastAsia="ru-RU"/>
         </w:rPr>
+        <w:t xml:space="preserve">Как указано выше это унифицированная платформа для передачи, приема и обработки радиосигналов в основной полосе частот. Планируется дальнейшее расширение ПО для гибкой настройки алгоритмов ЦОС. </w:t>
       </w:r>
     </w:p>
     <w:p>
@@ -2471,6 +3131,8 @@
         <w:pStyle w:val="Heading1"/>
         <w:rPr/>
       </w:pPr>
+      <w:bookmarkStart w:id="30" w:name="__RefHeading___Toc355_3911609550"/>
+      <w:bookmarkEnd w:id="30"/>
       <w:r>
         <w:rPr>
           <w:shd w:fill="FFFFFF" w:val="clear"/>
@@ -2488,6 +3150,8 @@
         <w:rPr/>
       </w:pPr>
       <w:hyperlink r:id="rId2">
+        <w:bookmarkStart w:id="31" w:name="__RefHeading___Toc357_3911609550"/>
+        <w:bookmarkEnd w:id="31"/>
         <w:r>
           <w:rPr>
             <w:rStyle w:val="Hyperlink"/>
@@ -2502,6 +3166,8 @@
         <w:rPr/>
       </w:pPr>
       <w:hyperlink r:id="rId3">
+        <w:bookmarkStart w:id="32" w:name="__RefHeading___Toc359_3911609550"/>
+        <w:bookmarkEnd w:id="32"/>
         <w:r>
           <w:rPr>
             <w:rStyle w:val="Hyperlink"/>
@@ -2516,6 +3182,8 @@
         <w:rPr/>
       </w:pPr>
       <w:hyperlink r:id="rId4">
+        <w:bookmarkStart w:id="33" w:name="__RefHeading___Toc361_3911609550"/>
+        <w:bookmarkEnd w:id="33"/>
         <w:r>
           <w:rPr>
             <w:rStyle w:val="Hyperlink"/>
@@ -2530,6 +3198,8 @@
         <w:rPr/>
       </w:pPr>
       <w:hyperlink r:id="rId5">
+        <w:bookmarkStart w:id="34" w:name="__RefHeading___Toc363_3911609550"/>
+        <w:bookmarkEnd w:id="34"/>
         <w:r>
           <w:rPr>
             <w:rStyle w:val="Hyperlink"/>
@@ -2544,6 +3214,8 @@
         <w:rPr/>
       </w:pPr>
       <w:hyperlink r:id="rId6">
+        <w:bookmarkStart w:id="35" w:name="__RefHeading___Toc365_3911609550"/>
+        <w:bookmarkEnd w:id="35"/>
         <w:r>
           <w:rPr>
             <w:rStyle w:val="Hyperlink"/>
@@ -2558,6 +3230,8 @@
         <w:rPr/>
       </w:pPr>
       <w:hyperlink r:id="rId7">
+        <w:bookmarkStart w:id="36" w:name="__RefHeading___Toc367_3911609550"/>
+        <w:bookmarkEnd w:id="36"/>
         <w:r>
           <w:rPr>
             <w:rStyle w:val="Hyperlink"/>
@@ -2574,7 +3248,9 @@
         </w:rPr>
       </w:pPr>
       <w:r>
-        <w:rPr/>
+        <w:rPr>
+          <w:rFonts w:eastAsia="" w:eastAsiaTheme="minorEastAsia"/>
+        </w:rPr>
       </w:r>
     </w:p>
     <w:p>
@@ -2646,7 +3322,7 @@
     </w:r>
     <w:r>
       <w:rPr/>
-      <w:t>8</w:t>
+      <w:t>10</w:t>
     </w:r>
     <w:r>
       <w:rPr/>
@@ -4447,12 +5123,17 @@
       <w:u w:val="single"/>
     </w:rPr>
   </w:style>
-  <w:style w:type="character" w:styleId="Style7">
-    <w:name w:val="Маркеры"/>
+  <w:style w:type="character" w:styleId="user">
+    <w:name w:val="Маркеры (user)"/>
     <w:qFormat/>
     <w:rPr>
       <w:rFonts w:ascii="OpenSymbol" w:hAnsi="OpenSymbol" w:eastAsia="OpenSymbol" w:cs="OpenSymbol"/>
     </w:rPr>
+  </w:style>
+  <w:style w:type="character" w:styleId="Style7">
+    <w:name w:val="Ссылка указателя"/>
+    <w:qFormat/>
+    <w:rPr/>
   </w:style>
   <w:style w:type="paragraph" w:styleId="Style8">
     <w:name w:val="Заголовок"/>
@@ -4523,7 +5204,7 @@
       <w:rFonts w:cs="Noto Sans Devanagari"/>
     </w:rPr>
   </w:style>
-  <w:style w:type="paragraph" w:styleId="user">
+  <w:style w:type="paragraph" w:styleId="user1">
     <w:name w:val="Заголовок (user)"/>
     <w:basedOn w:val="Normal"/>
     <w:next w:val="BodyText"/>
@@ -4538,7 +5219,7 @@
       <w:szCs w:val="28"/>
     </w:rPr>
   </w:style>
-  <w:style w:type="paragraph" w:styleId="user1">
+  <w:style w:type="paragraph" w:styleId="user2">
     <w:name w:val="Указатель (user)"/>
     <w:basedOn w:val="Normal"/>
     <w:qFormat/>
@@ -4549,15 +5230,15 @@
       <w:rFonts w:cs="Noto Sans Devanagari"/>
     </w:rPr>
   </w:style>
-  <w:style w:type="paragraph" w:styleId="user2">
-    <w:name w:val="Колонтитулы (user)"/>
+  <w:style w:type="paragraph" w:styleId="Style10">
+    <w:name w:val="Колонтитулы"/>
     <w:basedOn w:val="Normal"/>
     <w:qFormat/>
     <w:pPr/>
     <w:rPr/>
   </w:style>
-  <w:style w:type="paragraph" w:styleId="Style10">
-    <w:name w:val="Колонтитулы"/>
+  <w:style w:type="paragraph" w:styleId="user3">
+    <w:name w:val="Колонтитулы (user)"/>
     <w:basedOn w:val="Normal"/>
     <w:qFormat/>
     <w:pPr/>
@@ -4673,54 +5354,54 @@
   </w:style>
   <w:style w:type="paragraph" w:styleId="TOC3">
     <w:name w:val="toc 3"/>
-    <w:basedOn w:val="user1"/>
+    <w:basedOn w:val="Style9"/>
     <w:pPr/>
     <w:rPr/>
   </w:style>
   <w:style w:type="paragraph" w:styleId="TOC4">
     <w:name w:val="toc 4"/>
-    <w:basedOn w:val="user1"/>
+    <w:basedOn w:val="Style9"/>
     <w:pPr/>
     <w:rPr/>
   </w:style>
   <w:style w:type="paragraph" w:styleId="TOC5">
     <w:name w:val="toc 5"/>
-    <w:basedOn w:val="user1"/>
+    <w:basedOn w:val="Style9"/>
     <w:pPr/>
     <w:rPr/>
   </w:style>
   <w:style w:type="paragraph" w:styleId="TOC6">
     <w:name w:val="toc 6"/>
-    <w:basedOn w:val="user1"/>
+    <w:basedOn w:val="Style9"/>
     <w:pPr/>
     <w:rPr/>
   </w:style>
   <w:style w:type="paragraph" w:styleId="TOC7">
     <w:name w:val="toc 7"/>
-    <w:basedOn w:val="user1"/>
+    <w:basedOn w:val="Style9"/>
     <w:pPr/>
     <w:rPr/>
   </w:style>
   <w:style w:type="paragraph" w:styleId="TOC8">
     <w:name w:val="toc 8"/>
-    <w:basedOn w:val="user1"/>
+    <w:basedOn w:val="Style9"/>
     <w:pPr/>
     <w:rPr/>
   </w:style>
   <w:style w:type="paragraph" w:styleId="TOC9">
     <w:name w:val="toc 9"/>
-    <w:basedOn w:val="user1"/>
+    <w:basedOn w:val="Style9"/>
     <w:pPr/>
     <w:rPr/>
   </w:style>
   <w:style w:type="paragraph" w:styleId="Header">
     <w:name w:val="header"/>
-    <w:basedOn w:val="user2"/>
+    <w:basedOn w:val="Style10"/>
     <w:pPr/>
     <w:rPr/>
   </w:style>
-  <w:style w:type="numbering" w:styleId="user3" w:default="1">
-    <w:name w:val="Без списка (user)"/>
+  <w:style w:type="numbering" w:styleId="Style12" w:default="1">
+    <w:name w:val="Без списка"/>
     <w:uiPriority w:val="99"/>
     <w:semiHidden/>
     <w:unhideWhenUsed/>

</xml_diff>